<commit_message>
docs(submission): recompile submission package with 386 test metrics, clean typography, and repo hygiene rules
</commit_message>
<xml_diff>
--- a/docs/submission/playIT_SPMP_v2.0.docx
+++ b/docs/submission/playIT_SPMP_v2.0.docx
@@ -357,7 +357,7 @@
           <w:kern w:val="2"/>
           <w:sz w:val="24"/>
           <w:szCs w:val="24"/>
-          <w:lang w:val="en-PH" w:eastAsia="ja-JP"/>
+          <w:lang w:val="en-PH" w:eastAsia="en-PH"/>
           <w14:ligatures w14:val="standardContextual"/>
         </w:rPr>
       </w:pPr>
@@ -370,7 +370,7 @@
       <w:r>
         <w:fldChar w:fldCharType="separate"/>
       </w:r>
-      <w:hyperlink w:anchor="_Toc242537968" w:history="1">
+      <w:hyperlink w:anchor="_Toc242629068" w:history="1">
         <w:r>
           <w:rPr>
             <w:rStyle w:val="Hyperlink"/>
@@ -397,7 +397,7 @@
             <w:noProof/>
             <w:webHidden/>
           </w:rPr>
-          <w:instrText xml:space="preserve"> PAGEREF _Toc242537968 \h </w:instrText>
+          <w:instrText xml:space="preserve"> PAGEREF _Toc242629068 \h </w:instrText>
         </w:r>
         <w:r>
           <w:rPr>
@@ -441,11 +441,11 @@
           <w:kern w:val="2"/>
           <w:sz w:val="24"/>
           <w:szCs w:val="24"/>
-          <w:lang w:val="en-PH" w:eastAsia="ja-JP"/>
+          <w:lang w:val="en-PH" w:eastAsia="en-PH"/>
           <w14:ligatures w14:val="standardContextual"/>
         </w:rPr>
       </w:pPr>
-      <w:hyperlink w:anchor="_Toc242537969" w:history="1">
+      <w:hyperlink w:anchor="_Toc242629069" w:history="1">
         <w:r>
           <w:rPr>
             <w:rStyle w:val="Hyperlink"/>
@@ -472,7 +472,7 @@
             <w:noProof/>
             <w:webHidden/>
           </w:rPr>
-          <w:instrText xml:space="preserve"> PAGEREF _Toc242537969 \h </w:instrText>
+          <w:instrText xml:space="preserve"> PAGEREF _Toc242629069 \h </w:instrText>
         </w:r>
         <w:r>
           <w:rPr>
@@ -516,11 +516,11 @@
           <w:kern w:val="2"/>
           <w:sz w:val="24"/>
           <w:szCs w:val="24"/>
-          <w:lang w:val="en-PH" w:eastAsia="ja-JP"/>
+          <w:lang w:val="en-PH" w:eastAsia="en-PH"/>
           <w14:ligatures w14:val="standardContextual"/>
         </w:rPr>
       </w:pPr>
-      <w:hyperlink w:anchor="_Toc242537970" w:history="1">
+      <w:hyperlink w:anchor="_Toc242629070" w:history="1">
         <w:r>
           <w:rPr>
             <w:rStyle w:val="Hyperlink"/>
@@ -547,7 +547,7 @@
             <w:noProof/>
             <w:webHidden/>
           </w:rPr>
-          <w:instrText xml:space="preserve"> PAGEREF _Toc242537970 \h </w:instrText>
+          <w:instrText xml:space="preserve"> PAGEREF _Toc242629070 \h </w:instrText>
         </w:r>
         <w:r>
           <w:rPr>
@@ -591,11 +591,11 @@
           <w:kern w:val="2"/>
           <w:sz w:val="24"/>
           <w:szCs w:val="24"/>
-          <w:lang w:val="en-PH" w:eastAsia="ja-JP"/>
+          <w:lang w:val="en-PH" w:eastAsia="en-PH"/>
           <w14:ligatures w14:val="standardContextual"/>
         </w:rPr>
       </w:pPr>
-      <w:hyperlink w:anchor="_Toc242537971" w:history="1">
+      <w:hyperlink w:anchor="_Toc242629071" w:history="1">
         <w:r>
           <w:rPr>
             <w:rStyle w:val="Hyperlink"/>
@@ -622,7 +622,7 @@
             <w:noProof/>
             <w:webHidden/>
           </w:rPr>
-          <w:instrText xml:space="preserve"> PAGEREF _Toc242537971 \h </w:instrText>
+          <w:instrText xml:space="preserve"> PAGEREF _Toc242629071 \h </w:instrText>
         </w:r>
         <w:r>
           <w:rPr>
@@ -666,11 +666,11 @@
           <w:kern w:val="2"/>
           <w:sz w:val="24"/>
           <w:szCs w:val="24"/>
-          <w:lang w:val="en-PH" w:eastAsia="ja-JP"/>
+          <w:lang w:val="en-PH" w:eastAsia="en-PH"/>
           <w14:ligatures w14:val="standardContextual"/>
         </w:rPr>
       </w:pPr>
-      <w:hyperlink w:anchor="_Toc242537972" w:history="1">
+      <w:hyperlink w:anchor="_Toc242629072" w:history="1">
         <w:r>
           <w:rPr>
             <w:rStyle w:val="Hyperlink"/>
@@ -697,7 +697,7 @@
             <w:noProof/>
             <w:webHidden/>
           </w:rPr>
-          <w:instrText xml:space="preserve"> PAGEREF _Toc242537972 \h </w:instrText>
+          <w:instrText xml:space="preserve"> PAGEREF _Toc242629072 \h </w:instrText>
         </w:r>
         <w:r>
           <w:rPr>
@@ -741,11 +741,11 @@
           <w:kern w:val="2"/>
           <w:sz w:val="24"/>
           <w:szCs w:val="24"/>
-          <w:lang w:val="en-PH" w:eastAsia="ja-JP"/>
+          <w:lang w:val="en-PH" w:eastAsia="en-PH"/>
           <w14:ligatures w14:val="standardContextual"/>
         </w:rPr>
       </w:pPr>
-      <w:hyperlink w:anchor="_Toc242537973" w:history="1">
+      <w:hyperlink w:anchor="_Toc242629073" w:history="1">
         <w:r>
           <w:rPr>
             <w:rStyle w:val="Hyperlink"/>
@@ -772,7 +772,7 @@
             <w:noProof/>
             <w:webHidden/>
           </w:rPr>
-          <w:instrText xml:space="preserve"> PAGEREF _Toc242537973 \h </w:instrText>
+          <w:instrText xml:space="preserve"> PAGEREF _Toc242629073 \h </w:instrText>
         </w:r>
         <w:r>
           <w:rPr>
@@ -816,11 +816,11 @@
           <w:kern w:val="2"/>
           <w:sz w:val="24"/>
           <w:szCs w:val="24"/>
-          <w:lang w:val="en-PH" w:eastAsia="ja-JP"/>
+          <w:lang w:val="en-PH" w:eastAsia="en-PH"/>
           <w14:ligatures w14:val="standardContextual"/>
         </w:rPr>
       </w:pPr>
-      <w:hyperlink w:anchor="_Toc242537974" w:history="1">
+      <w:hyperlink w:anchor="_Toc242629074" w:history="1">
         <w:r>
           <w:rPr>
             <w:rStyle w:val="Hyperlink"/>
@@ -847,7 +847,7 @@
             <w:noProof/>
             <w:webHidden/>
           </w:rPr>
-          <w:instrText xml:space="preserve"> PAGEREF _Toc242537974 \h </w:instrText>
+          <w:instrText xml:space="preserve"> PAGEREF _Toc242629074 \h </w:instrText>
         </w:r>
         <w:r>
           <w:rPr>
@@ -891,11 +891,11 @@
           <w:kern w:val="2"/>
           <w:sz w:val="24"/>
           <w:szCs w:val="24"/>
-          <w:lang w:val="en-PH" w:eastAsia="ja-JP"/>
+          <w:lang w:val="en-PH" w:eastAsia="en-PH"/>
           <w14:ligatures w14:val="standardContextual"/>
         </w:rPr>
       </w:pPr>
-      <w:hyperlink w:anchor="_Toc242537975" w:history="1">
+      <w:hyperlink w:anchor="_Toc242629075" w:history="1">
         <w:r>
           <w:rPr>
             <w:rStyle w:val="Hyperlink"/>
@@ -922,7 +922,7 @@
             <w:noProof/>
             <w:webHidden/>
           </w:rPr>
-          <w:instrText xml:space="preserve"> PAGEREF _Toc242537975 \h </w:instrText>
+          <w:instrText xml:space="preserve"> PAGEREF _Toc242629075 \h </w:instrText>
         </w:r>
         <w:r>
           <w:rPr>
@@ -966,11 +966,11 @@
           <w:kern w:val="2"/>
           <w:sz w:val="24"/>
           <w:szCs w:val="24"/>
-          <w:lang w:val="en-PH" w:eastAsia="ja-JP"/>
+          <w:lang w:val="en-PH" w:eastAsia="en-PH"/>
           <w14:ligatures w14:val="standardContextual"/>
         </w:rPr>
       </w:pPr>
-      <w:hyperlink w:anchor="_Toc242537976" w:history="1">
+      <w:hyperlink w:anchor="_Toc242629076" w:history="1">
         <w:r>
           <w:rPr>
             <w:rStyle w:val="Hyperlink"/>
@@ -997,7 +997,7 @@
             <w:noProof/>
             <w:webHidden/>
           </w:rPr>
-          <w:instrText xml:space="preserve"> PAGEREF _Toc242537976 \h </w:instrText>
+          <w:instrText xml:space="preserve"> PAGEREF _Toc242629076 \h </w:instrText>
         </w:r>
         <w:r>
           <w:rPr>
@@ -1041,11 +1041,11 @@
           <w:kern w:val="2"/>
           <w:sz w:val="24"/>
           <w:szCs w:val="24"/>
-          <w:lang w:val="en-PH" w:eastAsia="ja-JP"/>
+          <w:lang w:val="en-PH" w:eastAsia="en-PH"/>
           <w14:ligatures w14:val="standardContextual"/>
         </w:rPr>
       </w:pPr>
-      <w:hyperlink w:anchor="_Toc242537977" w:history="1">
+      <w:hyperlink w:anchor="_Toc242629077" w:history="1">
         <w:r>
           <w:rPr>
             <w:rStyle w:val="Hyperlink"/>
@@ -1072,7 +1072,7 @@
             <w:noProof/>
             <w:webHidden/>
           </w:rPr>
-          <w:instrText xml:space="preserve"> PAGEREF _Toc242537977 \h </w:instrText>
+          <w:instrText xml:space="preserve"> PAGEREF _Toc242629077 \h </w:instrText>
         </w:r>
         <w:r>
           <w:rPr>
@@ -1116,11 +1116,11 @@
           <w:kern w:val="2"/>
           <w:sz w:val="24"/>
           <w:szCs w:val="24"/>
-          <w:lang w:val="en-PH" w:eastAsia="ja-JP"/>
+          <w:lang w:val="en-PH" w:eastAsia="en-PH"/>
           <w14:ligatures w14:val="standardContextual"/>
         </w:rPr>
       </w:pPr>
-      <w:hyperlink w:anchor="_Toc242537978" w:history="1">
+      <w:hyperlink w:anchor="_Toc242629078" w:history="1">
         <w:r>
           <w:rPr>
             <w:rStyle w:val="Hyperlink"/>
@@ -1147,7 +1147,7 @@
             <w:noProof/>
             <w:webHidden/>
           </w:rPr>
-          <w:instrText xml:space="preserve"> PAGEREF _Toc242537978 \h </w:instrText>
+          <w:instrText xml:space="preserve"> PAGEREF _Toc242629078 \h </w:instrText>
         </w:r>
         <w:r>
           <w:rPr>
@@ -1191,11 +1191,11 @@
           <w:kern w:val="2"/>
           <w:sz w:val="24"/>
           <w:szCs w:val="24"/>
-          <w:lang w:val="en-PH" w:eastAsia="ja-JP"/>
+          <w:lang w:val="en-PH" w:eastAsia="en-PH"/>
           <w14:ligatures w14:val="standardContextual"/>
         </w:rPr>
       </w:pPr>
-      <w:hyperlink w:anchor="_Toc242537979" w:history="1">
+      <w:hyperlink w:anchor="_Toc242629079" w:history="1">
         <w:r>
           <w:rPr>
             <w:rStyle w:val="Hyperlink"/>
@@ -1222,7 +1222,7 @@
             <w:noProof/>
             <w:webHidden/>
           </w:rPr>
-          <w:instrText xml:space="preserve"> PAGEREF _Toc242537979 \h </w:instrText>
+          <w:instrText xml:space="preserve"> PAGEREF _Toc242629079 \h </w:instrText>
         </w:r>
         <w:r>
           <w:rPr>
@@ -1266,11 +1266,11 @@
           <w:kern w:val="2"/>
           <w:sz w:val="24"/>
           <w:szCs w:val="24"/>
-          <w:lang w:val="en-PH" w:eastAsia="ja-JP"/>
+          <w:lang w:val="en-PH" w:eastAsia="en-PH"/>
           <w14:ligatures w14:val="standardContextual"/>
         </w:rPr>
       </w:pPr>
-      <w:hyperlink w:anchor="_Toc242537980" w:history="1">
+      <w:hyperlink w:anchor="_Toc242629080" w:history="1">
         <w:r>
           <w:rPr>
             <w:rStyle w:val="Hyperlink"/>
@@ -1297,7 +1297,7 @@
             <w:noProof/>
             <w:webHidden/>
           </w:rPr>
-          <w:instrText xml:space="preserve"> PAGEREF _Toc242537980 \h </w:instrText>
+          <w:instrText xml:space="preserve"> PAGEREF _Toc242629080 \h </w:instrText>
         </w:r>
         <w:r>
           <w:rPr>
@@ -1341,11 +1341,11 @@
           <w:kern w:val="2"/>
           <w:sz w:val="24"/>
           <w:szCs w:val="24"/>
-          <w:lang w:val="en-PH" w:eastAsia="ja-JP"/>
+          <w:lang w:val="en-PH" w:eastAsia="en-PH"/>
           <w14:ligatures w14:val="standardContextual"/>
         </w:rPr>
       </w:pPr>
-      <w:hyperlink w:anchor="_Toc242537981" w:history="1">
+      <w:hyperlink w:anchor="_Toc242629081" w:history="1">
         <w:r>
           <w:rPr>
             <w:rStyle w:val="Hyperlink"/>
@@ -1372,7 +1372,7 @@
             <w:noProof/>
             <w:webHidden/>
           </w:rPr>
-          <w:instrText xml:space="preserve"> PAGEREF _Toc242537981 \h </w:instrText>
+          <w:instrText xml:space="preserve"> PAGEREF _Toc242629081 \h </w:instrText>
         </w:r>
         <w:r>
           <w:rPr>
@@ -1416,11 +1416,11 @@
           <w:kern w:val="2"/>
           <w:sz w:val="24"/>
           <w:szCs w:val="24"/>
-          <w:lang w:val="en-PH" w:eastAsia="ja-JP"/>
+          <w:lang w:val="en-PH" w:eastAsia="en-PH"/>
           <w14:ligatures w14:val="standardContextual"/>
         </w:rPr>
       </w:pPr>
-      <w:hyperlink w:anchor="_Toc242537982" w:history="1">
+      <w:hyperlink w:anchor="_Toc242629082" w:history="1">
         <w:r>
           <w:rPr>
             <w:rStyle w:val="Hyperlink"/>
@@ -1447,7 +1447,7 @@
             <w:noProof/>
             <w:webHidden/>
           </w:rPr>
-          <w:instrText xml:space="preserve"> PAGEREF _Toc242537982 \h </w:instrText>
+          <w:instrText xml:space="preserve"> PAGEREF _Toc242629082 \h </w:instrText>
         </w:r>
         <w:r>
           <w:rPr>
@@ -1491,11 +1491,11 @@
           <w:kern w:val="2"/>
           <w:sz w:val="24"/>
           <w:szCs w:val="24"/>
-          <w:lang w:val="en-PH" w:eastAsia="ja-JP"/>
+          <w:lang w:val="en-PH" w:eastAsia="en-PH"/>
           <w14:ligatures w14:val="standardContextual"/>
         </w:rPr>
       </w:pPr>
-      <w:hyperlink w:anchor="_Toc242537983" w:history="1">
+      <w:hyperlink w:anchor="_Toc242629083" w:history="1">
         <w:r>
           <w:rPr>
             <w:rStyle w:val="Hyperlink"/>
@@ -1522,7 +1522,7 @@
             <w:noProof/>
             <w:webHidden/>
           </w:rPr>
-          <w:instrText xml:space="preserve"> PAGEREF _Toc242537983 \h </w:instrText>
+          <w:instrText xml:space="preserve"> PAGEREF _Toc242629083 \h </w:instrText>
         </w:r>
         <w:r>
           <w:rPr>
@@ -1567,7 +1567,7 @@
       <w:pPr>
         <w:pStyle w:val="Heading1"/>
       </w:pPr>
-      <w:bookmarkStart w:id="0" w:name="_Toc242537968"/>
+      <w:bookmarkStart w:id="0" w:name="_Toc242629068"/>
       <w:r>
         <w:t>Document Revision History</w:t>
       </w:r>
@@ -2288,7 +2288,7 @@
       <w:pPr>
         <w:pStyle w:val="Heading1"/>
       </w:pPr>
-      <w:bookmarkStart w:id="1" w:name="_Toc242537969"/>
+      <w:bookmarkStart w:id="1" w:name="_Toc242629069"/>
       <w:r>
         <w:t>1. Project Overview &amp; Scope Refactoring</w:t>
       </w:r>
@@ -2298,7 +2298,7 @@
       <w:pPr>
         <w:pStyle w:val="Heading2"/>
       </w:pPr>
-      <w:bookmarkStart w:id="2" w:name="_Toc242537970"/>
+      <w:bookmarkStart w:id="2" w:name="_Toc242629070"/>
       <w:r>
         <w:t>1.1 Project Purpose &amp; Executive Summary</w:t>
       </w:r>
@@ -2316,7 +2316,7 @@
       <w:pPr>
         <w:pStyle w:val="Heading2"/>
       </w:pPr>
-      <w:bookmarkStart w:id="3" w:name="_Toc242537971"/>
+      <w:bookmarkStart w:id="3" w:name="_Toc242629071"/>
       <w:r>
         <w:t>1.2 Interconnected Deliverables Traceability Baseline</w:t>
       </w:r>
@@ -3581,7 +3581,7 @@
       <w:pPr>
         <w:pStyle w:val="Heading2"/>
       </w:pPr>
-      <w:bookmarkStart w:id="4" w:name="_Toc242537972"/>
+      <w:bookmarkStart w:id="4" w:name="_Toc242629072"/>
       <w:r>
         <w:t>1.3 Scope Baseline &amp; Phased Implementation Strategy</w:t>
       </w:r>
@@ -3694,7 +3694,7 @@
       <w:pPr>
         <w:pStyle w:val="Heading1"/>
       </w:pPr>
-      <w:bookmarkStart w:id="5" w:name="_Toc242537973"/>
+      <w:bookmarkStart w:id="5" w:name="_Toc242629073"/>
       <w:r>
         <w:t>2. Work Breakdown Structure (WBS) &amp; Deliverables</w:t>
       </w:r>
@@ -4060,7 +4060,7 @@
       <w:pPr>
         <w:pStyle w:val="Heading1"/>
       </w:pPr>
-      <w:bookmarkStart w:id="6" w:name="_Toc242537974"/>
+      <w:bookmarkStart w:id="6" w:name="_Toc242629074"/>
       <w:r>
         <w:t>3. Activities, Milestones &amp; Revised Master Schedule</w:t>
       </w:r>
@@ -5274,7 +5274,7 @@
       <w:pPr>
         <w:pStyle w:val="Heading1"/>
       </w:pPr>
-      <w:bookmarkStart w:id="7" w:name="_Toc242537975"/>
+      <w:bookmarkStart w:id="7" w:name="_Toc242629075"/>
       <w:r>
         <w:t>4. Resource Allocation &amp; Infrastructure</w:t>
       </w:r>
@@ -5284,7 +5284,7 @@
       <w:pPr>
         <w:pStyle w:val="Heading2"/>
       </w:pPr>
-      <w:bookmarkStart w:id="8" w:name="_Toc242537976"/>
+      <w:bookmarkStart w:id="8" w:name="_Toc242629076"/>
       <w:r>
         <w:t>4.1 Development &amp; Processing Infrastructure</w:t>
       </w:r>
@@ -5366,7 +5366,7 @@
       <w:pPr>
         <w:pStyle w:val="Heading2"/>
       </w:pPr>
-      <w:bookmarkStart w:id="9" w:name="_Toc242537977"/>
+      <w:bookmarkStart w:id="9" w:name="_Toc242629077"/>
       <w:r>
         <w:t>4.2 Target Hardware &amp; Test Fleet</w:t>
       </w:r>
@@ -5424,7 +5424,7 @@
       <w:pPr>
         <w:pStyle w:val="Heading2"/>
       </w:pPr>
-      <w:bookmarkStart w:id="10" w:name="_Toc242537978"/>
+      <w:bookmarkStart w:id="10" w:name="_Toc242629078"/>
       <w:r>
         <w:t>4.3 Software Libraries &amp; Frameworks</w:t>
       </w:r>
@@ -5587,7 +5587,7 @@
       <w:pPr>
         <w:pStyle w:val="Heading1"/>
       </w:pPr>
-      <w:bookmarkStart w:id="11" w:name="_Toc242537979"/>
+      <w:bookmarkStart w:id="11" w:name="_Toc242629079"/>
       <w:r>
         <w:t>5. Team Roles and Responsibilities</w:t>
       </w:r>
@@ -6206,7 +6206,7 @@
       <w:pPr>
         <w:pStyle w:val="Heading1"/>
       </w:pPr>
-      <w:bookmarkStart w:id="12" w:name="_Toc242537980"/>
+      <w:bookmarkStart w:id="12" w:name="_Toc242629080"/>
       <w:r>
         <w:t>6. Comprehensive Risk Management &amp; Mitigation Matrix</w:t>
       </w:r>
@@ -7662,7 +7662,7 @@
       <w:pPr>
         <w:pStyle w:val="Heading1"/>
       </w:pPr>
-      <w:bookmarkStart w:id="13" w:name="_Toc242537981"/>
+      <w:bookmarkStart w:id="13" w:name="_Toc242629081"/>
       <w:r>
         <w:t>7. Configuration Management &amp; Quality Assurance</w:t>
       </w:r>
@@ -7672,7 +7672,7 @@
       <w:pPr>
         <w:pStyle w:val="Heading2"/>
       </w:pPr>
-      <w:bookmarkStart w:id="14" w:name="_Toc242537982"/>
+      <w:bookmarkStart w:id="14" w:name="_Toc242629082"/>
       <w:r>
         <w:t>7.1 Configuration Management &amp; Asset Versioning</w:t>
       </w:r>
@@ -7855,7 +7855,7 @@
       <w:pPr>
         <w:pStyle w:val="Heading2"/>
       </w:pPr>
-      <w:bookmarkStart w:id="15" w:name="_Toc242537983"/>
+      <w:bookmarkStart w:id="15" w:name="_Toc242629083"/>
       <w:r>
         <w:t>7.2 Quality Assurance &amp; Verification Protocol</w:t>
       </w:r>
@@ -8362,31 +8362,31 @@
       </w:rPr>
     </w:lvl>
   </w:abstractNum>
-  <w:num w:numId="1" w16cid:durableId="1627463506">
+  <w:num w:numId="1" w16cid:durableId="275452504">
     <w:abstractNumId w:val="8"/>
   </w:num>
-  <w:num w:numId="2" w16cid:durableId="961308877">
+  <w:num w:numId="2" w16cid:durableId="292171746">
     <w:abstractNumId w:val="6"/>
   </w:num>
-  <w:num w:numId="3" w16cid:durableId="591665649">
+  <w:num w:numId="3" w16cid:durableId="56438609">
     <w:abstractNumId w:val="5"/>
   </w:num>
-  <w:num w:numId="4" w16cid:durableId="568996873">
+  <w:num w:numId="4" w16cid:durableId="872498849">
     <w:abstractNumId w:val="4"/>
   </w:num>
-  <w:num w:numId="5" w16cid:durableId="1260681548">
+  <w:num w:numId="5" w16cid:durableId="1111818397">
     <w:abstractNumId w:val="7"/>
   </w:num>
-  <w:num w:numId="6" w16cid:durableId="1750497256">
+  <w:num w:numId="6" w16cid:durableId="475297678">
     <w:abstractNumId w:val="3"/>
   </w:num>
-  <w:num w:numId="7" w16cid:durableId="1985043093">
+  <w:num w:numId="7" w16cid:durableId="522400095">
     <w:abstractNumId w:val="2"/>
   </w:num>
-  <w:num w:numId="8" w16cid:durableId="804395583">
+  <w:num w:numId="8" w16cid:durableId="2036035152">
     <w:abstractNumId w:val="1"/>
   </w:num>
-  <w:num w:numId="9" w16cid:durableId="252855786">
+  <w:num w:numId="9" w16cid:durableId="376396983">
     <w:abstractNumId w:val="0"/>
   </w:num>
 </w:numbering>
@@ -19781,7 +19781,7 @@
     <w:autoRedefine/>
     <w:uiPriority w:val="39"/>
     <w:unhideWhenUsed/>
-    <w:rsid w:val="00E47774"/>
+    <w:rsid w:val="00F93019"/>
     <w:pPr>
       <w:spacing w:after="100"/>
     </w:pPr>
@@ -19793,7 +19793,7 @@
     <w:autoRedefine/>
     <w:uiPriority w:val="39"/>
     <w:unhideWhenUsed/>
-    <w:rsid w:val="00E47774"/>
+    <w:rsid w:val="00F93019"/>
     <w:pPr>
       <w:spacing w:after="100"/>
       <w:ind w:left="200"/>
@@ -19804,7 +19804,7 @@
     <w:basedOn w:val="DefaultParagraphFont"/>
     <w:uiPriority w:val="99"/>
     <w:unhideWhenUsed/>
-    <w:rsid w:val="00E47774"/>
+    <w:rsid w:val="00F93019"/>
     <w:rPr>
       <w:color w:val="0000FF" w:themeColor="hyperlink"/>
       <w:u w:val="single"/>

</xml_diff>

<commit_message>
docs(submission): set section to IT411 G7 and update submission documents
</commit_message>
<xml_diff>
--- a/docs/submission/playIT_SPMP_v2.0.docx
+++ b/docs/submission/playIT_SPMP_v2.0.docx
@@ -127,7 +127,7 @@
               <w:rPr>
                 <w:sz w:val="19"/>
               </w:rPr>
-              <w:t>IT411 — Capstone &amp; Research 2 | Semester 1, AY 2026–2027</w:t>
+              <w:t>IT411 (Section G7) — Capstone &amp; Research 2 | Semester 1, AY 2026–2027</w:t>
             </w:r>
           </w:p>
         </w:tc>
@@ -344,7 +344,7 @@
           <w:kern w:val="2"/>
           <w:sz w:val="24"/>
           <w:szCs w:val="24"/>
-          <w:lang w:val="en-PH" w:eastAsia="ja-JP"/>
+          <w:lang w:val="en-PH" w:eastAsia="en-PH"/>
           <w14:ligatures w14:val="standardContextual"/>
         </w:rPr>
       </w:pPr>
@@ -357,7 +357,7 @@
       <w:r>
         <w:fldChar w:fldCharType="separate"/>
       </w:r>
-      <w:hyperlink w:anchor="_Toc242632200" w:history="1">
+      <w:hyperlink w:anchor="_Toc242634352" w:history="1">
         <w:r>
           <w:rPr>
             <w:rStyle w:val="Hyperlink"/>
@@ -384,7 +384,7 @@
             <w:noProof/>
             <w:webHidden/>
           </w:rPr>
-          <w:instrText xml:space="preserve"> PAGEREF _Toc242632200 \h </w:instrText>
+          <w:instrText xml:space="preserve"> PAGEREF _Toc242634352 \h </w:instrText>
         </w:r>
         <w:r>
           <w:rPr>
@@ -428,11 +428,11 @@
           <w:kern w:val="2"/>
           <w:sz w:val="24"/>
           <w:szCs w:val="24"/>
-          <w:lang w:val="en-PH" w:eastAsia="ja-JP"/>
+          <w:lang w:val="en-PH" w:eastAsia="en-PH"/>
           <w14:ligatures w14:val="standardContextual"/>
         </w:rPr>
       </w:pPr>
-      <w:hyperlink w:anchor="_Toc242632201" w:history="1">
+      <w:hyperlink w:anchor="_Toc242634353" w:history="1">
         <w:r>
           <w:rPr>
             <w:rStyle w:val="Hyperlink"/>
@@ -459,7 +459,7 @@
             <w:noProof/>
             <w:webHidden/>
           </w:rPr>
-          <w:instrText xml:space="preserve"> PAGEREF _Toc242632201 \h </w:instrText>
+          <w:instrText xml:space="preserve"> PAGEREF _Toc242634353 \h </w:instrText>
         </w:r>
         <w:r>
           <w:rPr>
@@ -503,11 +503,11 @@
           <w:kern w:val="2"/>
           <w:sz w:val="24"/>
           <w:szCs w:val="24"/>
-          <w:lang w:val="en-PH" w:eastAsia="ja-JP"/>
+          <w:lang w:val="en-PH" w:eastAsia="en-PH"/>
           <w14:ligatures w14:val="standardContextual"/>
         </w:rPr>
       </w:pPr>
-      <w:hyperlink w:anchor="_Toc242632202" w:history="1">
+      <w:hyperlink w:anchor="_Toc242634354" w:history="1">
         <w:r>
           <w:rPr>
             <w:rStyle w:val="Hyperlink"/>
@@ -534,7 +534,7 @@
             <w:noProof/>
             <w:webHidden/>
           </w:rPr>
-          <w:instrText xml:space="preserve"> PAGEREF _Toc242632202 \h </w:instrText>
+          <w:instrText xml:space="preserve"> PAGEREF _Toc242634354 \h </w:instrText>
         </w:r>
         <w:r>
           <w:rPr>
@@ -578,11 +578,11 @@
           <w:kern w:val="2"/>
           <w:sz w:val="24"/>
           <w:szCs w:val="24"/>
-          <w:lang w:val="en-PH" w:eastAsia="ja-JP"/>
+          <w:lang w:val="en-PH" w:eastAsia="en-PH"/>
           <w14:ligatures w14:val="standardContextual"/>
         </w:rPr>
       </w:pPr>
-      <w:hyperlink w:anchor="_Toc242632203" w:history="1">
+      <w:hyperlink w:anchor="_Toc242634355" w:history="1">
         <w:r>
           <w:rPr>
             <w:rStyle w:val="Hyperlink"/>
@@ -609,7 +609,7 @@
             <w:noProof/>
             <w:webHidden/>
           </w:rPr>
-          <w:instrText xml:space="preserve"> PAGEREF _Toc242632203 \h </w:instrText>
+          <w:instrText xml:space="preserve"> PAGEREF _Toc242634355 \h </w:instrText>
         </w:r>
         <w:r>
           <w:rPr>
@@ -653,11 +653,11 @@
           <w:kern w:val="2"/>
           <w:sz w:val="24"/>
           <w:szCs w:val="24"/>
-          <w:lang w:val="en-PH" w:eastAsia="ja-JP"/>
+          <w:lang w:val="en-PH" w:eastAsia="en-PH"/>
           <w14:ligatures w14:val="standardContextual"/>
         </w:rPr>
       </w:pPr>
-      <w:hyperlink w:anchor="_Toc242632204" w:history="1">
+      <w:hyperlink w:anchor="_Toc242634356" w:history="1">
         <w:r>
           <w:rPr>
             <w:rStyle w:val="Hyperlink"/>
@@ -684,7 +684,7 @@
             <w:noProof/>
             <w:webHidden/>
           </w:rPr>
-          <w:instrText xml:space="preserve"> PAGEREF _Toc242632204 \h </w:instrText>
+          <w:instrText xml:space="preserve"> PAGEREF _Toc242634356 \h </w:instrText>
         </w:r>
         <w:r>
           <w:rPr>
@@ -728,11 +728,11 @@
           <w:kern w:val="2"/>
           <w:sz w:val="24"/>
           <w:szCs w:val="24"/>
-          <w:lang w:val="en-PH" w:eastAsia="ja-JP"/>
+          <w:lang w:val="en-PH" w:eastAsia="en-PH"/>
           <w14:ligatures w14:val="standardContextual"/>
         </w:rPr>
       </w:pPr>
-      <w:hyperlink w:anchor="_Toc242632205" w:history="1">
+      <w:hyperlink w:anchor="_Toc242634357" w:history="1">
         <w:r>
           <w:rPr>
             <w:rStyle w:val="Hyperlink"/>
@@ -759,7 +759,7 @@
             <w:noProof/>
             <w:webHidden/>
           </w:rPr>
-          <w:instrText xml:space="preserve"> PAGEREF _Toc242632205 \h </w:instrText>
+          <w:instrText xml:space="preserve"> PAGEREF _Toc242634357 \h </w:instrText>
         </w:r>
         <w:r>
           <w:rPr>
@@ -803,11 +803,11 @@
           <w:kern w:val="2"/>
           <w:sz w:val="24"/>
           <w:szCs w:val="24"/>
-          <w:lang w:val="en-PH" w:eastAsia="ja-JP"/>
+          <w:lang w:val="en-PH" w:eastAsia="en-PH"/>
           <w14:ligatures w14:val="standardContextual"/>
         </w:rPr>
       </w:pPr>
-      <w:hyperlink w:anchor="_Toc242632206" w:history="1">
+      <w:hyperlink w:anchor="_Toc242634358" w:history="1">
         <w:r>
           <w:rPr>
             <w:rStyle w:val="Hyperlink"/>
@@ -834,7 +834,7 @@
             <w:noProof/>
             <w:webHidden/>
           </w:rPr>
-          <w:instrText xml:space="preserve"> PAGEREF _Toc242632206 \h </w:instrText>
+          <w:instrText xml:space="preserve"> PAGEREF _Toc242634358 \h </w:instrText>
         </w:r>
         <w:r>
           <w:rPr>
@@ -878,11 +878,11 @@
           <w:kern w:val="2"/>
           <w:sz w:val="24"/>
           <w:szCs w:val="24"/>
-          <w:lang w:val="en-PH" w:eastAsia="ja-JP"/>
+          <w:lang w:val="en-PH" w:eastAsia="en-PH"/>
           <w14:ligatures w14:val="standardContextual"/>
         </w:rPr>
       </w:pPr>
-      <w:hyperlink w:anchor="_Toc242632207" w:history="1">
+      <w:hyperlink w:anchor="_Toc242634359" w:history="1">
         <w:r>
           <w:rPr>
             <w:rStyle w:val="Hyperlink"/>
@@ -909,7 +909,7 @@
             <w:noProof/>
             <w:webHidden/>
           </w:rPr>
-          <w:instrText xml:space="preserve"> PAGEREF _Toc242632207 \h </w:instrText>
+          <w:instrText xml:space="preserve"> PAGEREF _Toc242634359 \h </w:instrText>
         </w:r>
         <w:r>
           <w:rPr>
@@ -953,11 +953,11 @@
           <w:kern w:val="2"/>
           <w:sz w:val="24"/>
           <w:szCs w:val="24"/>
-          <w:lang w:val="en-PH" w:eastAsia="ja-JP"/>
+          <w:lang w:val="en-PH" w:eastAsia="en-PH"/>
           <w14:ligatures w14:val="standardContextual"/>
         </w:rPr>
       </w:pPr>
-      <w:hyperlink w:anchor="_Toc242632208" w:history="1">
+      <w:hyperlink w:anchor="_Toc242634360" w:history="1">
         <w:r>
           <w:rPr>
             <w:rStyle w:val="Hyperlink"/>
@@ -984,7 +984,7 @@
             <w:noProof/>
             <w:webHidden/>
           </w:rPr>
-          <w:instrText xml:space="preserve"> PAGEREF _Toc242632208 \h </w:instrText>
+          <w:instrText xml:space="preserve"> PAGEREF _Toc242634360 \h </w:instrText>
         </w:r>
         <w:r>
           <w:rPr>
@@ -1028,11 +1028,11 @@
           <w:kern w:val="2"/>
           <w:sz w:val="24"/>
           <w:szCs w:val="24"/>
-          <w:lang w:val="en-PH" w:eastAsia="ja-JP"/>
+          <w:lang w:val="en-PH" w:eastAsia="en-PH"/>
           <w14:ligatures w14:val="standardContextual"/>
         </w:rPr>
       </w:pPr>
-      <w:hyperlink w:anchor="_Toc242632209" w:history="1">
+      <w:hyperlink w:anchor="_Toc242634361" w:history="1">
         <w:r>
           <w:rPr>
             <w:rStyle w:val="Hyperlink"/>
@@ -1059,7 +1059,7 @@
             <w:noProof/>
             <w:webHidden/>
           </w:rPr>
-          <w:instrText xml:space="preserve"> PAGEREF _Toc242632209 \h </w:instrText>
+          <w:instrText xml:space="preserve"> PAGEREF _Toc242634361 \h </w:instrText>
         </w:r>
         <w:r>
           <w:rPr>
@@ -1103,11 +1103,11 @@
           <w:kern w:val="2"/>
           <w:sz w:val="24"/>
           <w:szCs w:val="24"/>
-          <w:lang w:val="en-PH" w:eastAsia="ja-JP"/>
+          <w:lang w:val="en-PH" w:eastAsia="en-PH"/>
           <w14:ligatures w14:val="standardContextual"/>
         </w:rPr>
       </w:pPr>
-      <w:hyperlink w:anchor="_Toc242632210" w:history="1">
+      <w:hyperlink w:anchor="_Toc242634362" w:history="1">
         <w:r>
           <w:rPr>
             <w:rStyle w:val="Hyperlink"/>
@@ -1134,7 +1134,7 @@
             <w:noProof/>
             <w:webHidden/>
           </w:rPr>
-          <w:instrText xml:space="preserve"> PAGEREF _Toc242632210 \h </w:instrText>
+          <w:instrText xml:space="preserve"> PAGEREF _Toc242634362 \h </w:instrText>
         </w:r>
         <w:r>
           <w:rPr>
@@ -1178,11 +1178,11 @@
           <w:kern w:val="2"/>
           <w:sz w:val="24"/>
           <w:szCs w:val="24"/>
-          <w:lang w:val="en-PH" w:eastAsia="ja-JP"/>
+          <w:lang w:val="en-PH" w:eastAsia="en-PH"/>
           <w14:ligatures w14:val="standardContextual"/>
         </w:rPr>
       </w:pPr>
-      <w:hyperlink w:anchor="_Toc242632211" w:history="1">
+      <w:hyperlink w:anchor="_Toc242634363" w:history="1">
         <w:r>
           <w:rPr>
             <w:rStyle w:val="Hyperlink"/>
@@ -1209,7 +1209,7 @@
             <w:noProof/>
             <w:webHidden/>
           </w:rPr>
-          <w:instrText xml:space="preserve"> PAGEREF _Toc242632211 \h </w:instrText>
+          <w:instrText xml:space="preserve"> PAGEREF _Toc242634363 \h </w:instrText>
         </w:r>
         <w:r>
           <w:rPr>
@@ -1253,11 +1253,11 @@
           <w:kern w:val="2"/>
           <w:sz w:val="24"/>
           <w:szCs w:val="24"/>
-          <w:lang w:val="en-PH" w:eastAsia="ja-JP"/>
+          <w:lang w:val="en-PH" w:eastAsia="en-PH"/>
           <w14:ligatures w14:val="standardContextual"/>
         </w:rPr>
       </w:pPr>
-      <w:hyperlink w:anchor="_Toc242632212" w:history="1">
+      <w:hyperlink w:anchor="_Toc242634364" w:history="1">
         <w:r>
           <w:rPr>
             <w:rStyle w:val="Hyperlink"/>
@@ -1284,7 +1284,7 @@
             <w:noProof/>
             <w:webHidden/>
           </w:rPr>
-          <w:instrText xml:space="preserve"> PAGEREF _Toc242632212 \h </w:instrText>
+          <w:instrText xml:space="preserve"> PAGEREF _Toc242634364 \h </w:instrText>
         </w:r>
         <w:r>
           <w:rPr>
@@ -1328,11 +1328,11 @@
           <w:kern w:val="2"/>
           <w:sz w:val="24"/>
           <w:szCs w:val="24"/>
-          <w:lang w:val="en-PH" w:eastAsia="ja-JP"/>
+          <w:lang w:val="en-PH" w:eastAsia="en-PH"/>
           <w14:ligatures w14:val="standardContextual"/>
         </w:rPr>
       </w:pPr>
-      <w:hyperlink w:anchor="_Toc242632213" w:history="1">
+      <w:hyperlink w:anchor="_Toc242634365" w:history="1">
         <w:r>
           <w:rPr>
             <w:rStyle w:val="Hyperlink"/>
@@ -1359,7 +1359,7 @@
             <w:noProof/>
             <w:webHidden/>
           </w:rPr>
-          <w:instrText xml:space="preserve"> PAGEREF _Toc242632213 \h </w:instrText>
+          <w:instrText xml:space="preserve"> PAGEREF _Toc242634365 \h </w:instrText>
         </w:r>
         <w:r>
           <w:rPr>
@@ -1403,11 +1403,11 @@
           <w:kern w:val="2"/>
           <w:sz w:val="24"/>
           <w:szCs w:val="24"/>
-          <w:lang w:val="en-PH" w:eastAsia="ja-JP"/>
+          <w:lang w:val="en-PH" w:eastAsia="en-PH"/>
           <w14:ligatures w14:val="standardContextual"/>
         </w:rPr>
       </w:pPr>
-      <w:hyperlink w:anchor="_Toc242632214" w:history="1">
+      <w:hyperlink w:anchor="_Toc242634366" w:history="1">
         <w:r>
           <w:rPr>
             <w:rStyle w:val="Hyperlink"/>
@@ -1434,7 +1434,7 @@
             <w:noProof/>
             <w:webHidden/>
           </w:rPr>
-          <w:instrText xml:space="preserve"> PAGEREF _Toc242632214 \h </w:instrText>
+          <w:instrText xml:space="preserve"> PAGEREF _Toc242634366 \h </w:instrText>
         </w:r>
         <w:r>
           <w:rPr>
@@ -1478,11 +1478,11 @@
           <w:kern w:val="2"/>
           <w:sz w:val="24"/>
           <w:szCs w:val="24"/>
-          <w:lang w:val="en-PH" w:eastAsia="ja-JP"/>
+          <w:lang w:val="en-PH" w:eastAsia="en-PH"/>
           <w14:ligatures w14:val="standardContextual"/>
         </w:rPr>
       </w:pPr>
-      <w:hyperlink w:anchor="_Toc242632215" w:history="1">
+      <w:hyperlink w:anchor="_Toc242634367" w:history="1">
         <w:r>
           <w:rPr>
             <w:rStyle w:val="Hyperlink"/>
@@ -1509,7 +1509,7 @@
             <w:noProof/>
             <w:webHidden/>
           </w:rPr>
-          <w:instrText xml:space="preserve"> PAGEREF _Toc242632215 \h </w:instrText>
+          <w:instrText xml:space="preserve"> PAGEREF _Toc242634367 \h </w:instrText>
         </w:r>
         <w:r>
           <w:rPr>
@@ -1554,7 +1554,7 @@
       <w:pPr>
         <w:pStyle w:val="Heading1"/>
       </w:pPr>
-      <w:bookmarkStart w:id="0" w:name="_Toc242632200"/>
+      <w:bookmarkStart w:id="0" w:name="_Toc242634352"/>
       <w:r>
         <w:t>Document Revision History</w:t>
       </w:r>
@@ -2353,7 +2353,7 @@
       <w:pPr>
         <w:pStyle w:val="Heading1"/>
       </w:pPr>
-      <w:bookmarkStart w:id="1" w:name="_Toc242632201"/>
+      <w:bookmarkStart w:id="1" w:name="_Toc242634353"/>
       <w:r>
         <w:t>1. Project Overview &amp; Scope Refactoring</w:t>
       </w:r>
@@ -2363,7 +2363,7 @@
       <w:pPr>
         <w:pStyle w:val="Heading2"/>
       </w:pPr>
-      <w:bookmarkStart w:id="2" w:name="_Toc242632202"/>
+      <w:bookmarkStart w:id="2" w:name="_Toc242634354"/>
       <w:r>
         <w:t>1.1 Project Purpose &amp; Executive Summary</w:t>
       </w:r>
@@ -2381,7 +2381,7 @@
       <w:pPr>
         <w:pStyle w:val="Heading2"/>
       </w:pPr>
-      <w:bookmarkStart w:id="3" w:name="_Toc242632203"/>
+      <w:bookmarkStart w:id="3" w:name="_Toc242634355"/>
       <w:r>
         <w:t>1.2 Interconnected Deliverables Traceability Baseline</w:t>
       </w:r>
@@ -3646,7 +3646,7 @@
       <w:pPr>
         <w:pStyle w:val="Heading2"/>
       </w:pPr>
-      <w:bookmarkStart w:id="4" w:name="_Toc242632204"/>
+      <w:bookmarkStart w:id="4" w:name="_Toc242634356"/>
       <w:r>
         <w:t>1.3 Scope Baseline &amp; Phased Implementation Strategy</w:t>
       </w:r>
@@ -3759,7 +3759,7 @@
       <w:pPr>
         <w:pStyle w:val="Heading1"/>
       </w:pPr>
-      <w:bookmarkStart w:id="5" w:name="_Toc242632205"/>
+      <w:bookmarkStart w:id="5" w:name="_Toc242634357"/>
       <w:r>
         <w:t>2. Work Breakdown Structure (WBS) &amp; Deliverables</w:t>
       </w:r>
@@ -4125,7 +4125,7 @@
       <w:pPr>
         <w:pStyle w:val="Heading1"/>
       </w:pPr>
-      <w:bookmarkStart w:id="6" w:name="_Toc242632206"/>
+      <w:bookmarkStart w:id="6" w:name="_Toc242634358"/>
       <w:r>
         <w:t>3. Activities, Milestones &amp; Revised Master Schedule</w:t>
       </w:r>
@@ -5339,7 +5339,7 @@
       <w:pPr>
         <w:pStyle w:val="Heading1"/>
       </w:pPr>
-      <w:bookmarkStart w:id="7" w:name="_Toc242632207"/>
+      <w:bookmarkStart w:id="7" w:name="_Toc242634359"/>
       <w:r>
         <w:t>4. Resource Allocation &amp; Infrastructure</w:t>
       </w:r>
@@ -5349,7 +5349,7 @@
       <w:pPr>
         <w:pStyle w:val="Heading2"/>
       </w:pPr>
-      <w:bookmarkStart w:id="8" w:name="_Toc242632208"/>
+      <w:bookmarkStart w:id="8" w:name="_Toc242634360"/>
       <w:r>
         <w:t>4.1 Development &amp; Processing Infrastructure</w:t>
       </w:r>
@@ -5431,7 +5431,7 @@
       <w:pPr>
         <w:pStyle w:val="Heading2"/>
       </w:pPr>
-      <w:bookmarkStart w:id="9" w:name="_Toc242632209"/>
+      <w:bookmarkStart w:id="9" w:name="_Toc242634361"/>
       <w:r>
         <w:t>4.2 Target Hardware &amp; Test Fleet</w:t>
       </w:r>
@@ -5489,7 +5489,7 @@
       <w:pPr>
         <w:pStyle w:val="Heading2"/>
       </w:pPr>
-      <w:bookmarkStart w:id="10" w:name="_Toc242632210"/>
+      <w:bookmarkStart w:id="10" w:name="_Toc242634362"/>
       <w:r>
         <w:t>4.3 Software Libraries &amp; Frameworks</w:t>
       </w:r>
@@ -5652,7 +5652,7 @@
       <w:pPr>
         <w:pStyle w:val="Heading1"/>
       </w:pPr>
-      <w:bookmarkStart w:id="11" w:name="_Toc242632211"/>
+      <w:bookmarkStart w:id="11" w:name="_Toc242634363"/>
       <w:r>
         <w:t>5. Team Roles and Responsibilities</w:t>
       </w:r>
@@ -6271,7 +6271,7 @@
       <w:pPr>
         <w:pStyle w:val="Heading1"/>
       </w:pPr>
-      <w:bookmarkStart w:id="12" w:name="_Toc242632212"/>
+      <w:bookmarkStart w:id="12" w:name="_Toc242634364"/>
       <w:r>
         <w:t>6. Comprehensive Risk Management &amp; Mitigation Matrix</w:t>
       </w:r>
@@ -7727,7 +7727,7 @@
       <w:pPr>
         <w:pStyle w:val="Heading1"/>
       </w:pPr>
-      <w:bookmarkStart w:id="13" w:name="_Toc242632213"/>
+      <w:bookmarkStart w:id="13" w:name="_Toc242634365"/>
       <w:r>
         <w:t>7. Configuration Management &amp; Quality Assurance</w:t>
       </w:r>
@@ -7737,7 +7737,7 @@
       <w:pPr>
         <w:pStyle w:val="Heading2"/>
       </w:pPr>
-      <w:bookmarkStart w:id="14" w:name="_Toc242632214"/>
+      <w:bookmarkStart w:id="14" w:name="_Toc242634366"/>
       <w:r>
         <w:t>7.1 Configuration Management &amp; Asset Versioning</w:t>
       </w:r>
@@ -7920,7 +7920,7 @@
       <w:pPr>
         <w:pStyle w:val="Heading2"/>
       </w:pPr>
-      <w:bookmarkStart w:id="15" w:name="_Toc242632215"/>
+      <w:bookmarkStart w:id="15" w:name="_Toc242634367"/>
       <w:r>
         <w:t>7.2 Quality Assurance &amp; Verification Protocol</w:t>
       </w:r>
@@ -8427,31 +8427,31 @@
       </w:rPr>
     </w:lvl>
   </w:abstractNum>
-  <w:num w:numId="1" w16cid:durableId="399912120">
+  <w:num w:numId="1" w16cid:durableId="1583643047">
     <w:abstractNumId w:val="8"/>
   </w:num>
-  <w:num w:numId="2" w16cid:durableId="1732269065">
+  <w:num w:numId="2" w16cid:durableId="1928885158">
     <w:abstractNumId w:val="6"/>
   </w:num>
-  <w:num w:numId="3" w16cid:durableId="1147630966">
+  <w:num w:numId="3" w16cid:durableId="999651822">
     <w:abstractNumId w:val="5"/>
   </w:num>
-  <w:num w:numId="4" w16cid:durableId="37902453">
+  <w:num w:numId="4" w16cid:durableId="1854688908">
     <w:abstractNumId w:val="4"/>
   </w:num>
-  <w:num w:numId="5" w16cid:durableId="892304471">
+  <w:num w:numId="5" w16cid:durableId="1481076733">
     <w:abstractNumId w:val="7"/>
   </w:num>
-  <w:num w:numId="6" w16cid:durableId="713045745">
+  <w:num w:numId="6" w16cid:durableId="1615406233">
     <w:abstractNumId w:val="3"/>
   </w:num>
-  <w:num w:numId="7" w16cid:durableId="1443067269">
+  <w:num w:numId="7" w16cid:durableId="1109742133">
     <w:abstractNumId w:val="2"/>
   </w:num>
-  <w:num w:numId="8" w16cid:durableId="1958678869">
+  <w:num w:numId="8" w16cid:durableId="1994139134">
     <w:abstractNumId w:val="1"/>
   </w:num>
-  <w:num w:numId="9" w16cid:durableId="893351499">
+  <w:num w:numId="9" w16cid:durableId="1151411523">
     <w:abstractNumId w:val="0"/>
   </w:num>
 </w:numbering>
@@ -19846,7 +19846,7 @@
     <w:autoRedefine/>
     <w:uiPriority w:val="39"/>
     <w:unhideWhenUsed/>
-    <w:rsid w:val="00C46A5A"/>
+    <w:rsid w:val="00751F59"/>
     <w:pPr>
       <w:spacing w:after="100"/>
     </w:pPr>
@@ -19858,7 +19858,7 @@
     <w:autoRedefine/>
     <w:uiPriority w:val="39"/>
     <w:unhideWhenUsed/>
-    <w:rsid w:val="00C46A5A"/>
+    <w:rsid w:val="00751F59"/>
     <w:pPr>
       <w:spacing w:after="100"/>
       <w:ind w:left="200"/>
@@ -19869,7 +19869,7 @@
     <w:basedOn w:val="DefaultParagraphFont"/>
     <w:uiPriority w:val="99"/>
     <w:unhideWhenUsed/>
-    <w:rsid w:val="00C46A5A"/>
+    <w:rsid w:val="00751F59"/>
     <w:rPr>
       <w:color w:val="0000FF" w:themeColor="hyperlink"/>
       <w:u w:val="single"/>

</xml_diff>

<commit_message>
docs: harmonize formal specs revision history and re-render midterm package
</commit_message>
<xml_diff>
--- a/docs/submission/playIT_SPMP_v2.0.docx
+++ b/docs/submission/playIT_SPMP_v2.0.docx
@@ -12,7 +12,7 @@
           <w:noProof/>
         </w:rPr>
         <w:drawing>
-          <wp:inline distT="0" distB="0" distL="0" distR="0" wp14:anchorId="5E63DBD8" wp14:editId="37F5CF07">
+          <wp:inline distT="0" distB="0" distL="0" distR="0" wp14:anchorId="6566CF24" wp14:editId="34258E2B">
             <wp:extent cx="1463040" cy="1034415"/>
             <wp:effectExtent l="0" t="0" r="0" b="0"/>
             <wp:docPr id="1" name="Picture 1"/>
@@ -403,7 +403,7 @@
       <w:r>
         <w:fldChar w:fldCharType="separate"/>
       </w:r>
-      <w:hyperlink w:anchor="_Toc242912322" w:history="1">
+      <w:hyperlink w:anchor="_Toc243212139" w:history="1">
         <w:r>
           <w:rPr>
             <w:rStyle w:val="Hyperlink"/>
@@ -430,7 +430,7 @@
             <w:noProof/>
             <w:webHidden/>
           </w:rPr>
-          <w:instrText xml:space="preserve"> PAGEREF _Toc242912322 \h </w:instrText>
+          <w:instrText xml:space="preserve"> PAGEREF _Toc243212139 \h </w:instrText>
         </w:r>
         <w:r>
           <w:rPr>
@@ -478,7 +478,7 @@
           <w14:ligatures w14:val="standardContextual"/>
         </w:rPr>
       </w:pPr>
-      <w:hyperlink w:anchor="_Toc242912323" w:history="1">
+      <w:hyperlink w:anchor="_Toc243212140" w:history="1">
         <w:r>
           <w:rPr>
             <w:rStyle w:val="Hyperlink"/>
@@ -505,7 +505,7 @@
             <w:noProof/>
             <w:webHidden/>
           </w:rPr>
-          <w:instrText xml:space="preserve"> PAGEREF _Toc242912323 \h </w:instrText>
+          <w:instrText xml:space="preserve"> PAGEREF _Toc243212140 \h </w:instrText>
         </w:r>
         <w:r>
           <w:rPr>
@@ -553,7 +553,7 @@
           <w14:ligatures w14:val="standardContextual"/>
         </w:rPr>
       </w:pPr>
-      <w:hyperlink w:anchor="_Toc242912324" w:history="1">
+      <w:hyperlink w:anchor="_Toc243212141" w:history="1">
         <w:r>
           <w:rPr>
             <w:rStyle w:val="Hyperlink"/>
@@ -580,7 +580,7 @@
             <w:noProof/>
             <w:webHidden/>
           </w:rPr>
-          <w:instrText xml:space="preserve"> PAGEREF _Toc242912324 \h </w:instrText>
+          <w:instrText xml:space="preserve"> PAGEREF _Toc243212141 \h </w:instrText>
         </w:r>
         <w:r>
           <w:rPr>
@@ -628,7 +628,7 @@
           <w14:ligatures w14:val="standardContextual"/>
         </w:rPr>
       </w:pPr>
-      <w:hyperlink w:anchor="_Toc242912325" w:history="1">
+      <w:hyperlink w:anchor="_Toc243212142" w:history="1">
         <w:r>
           <w:rPr>
             <w:rStyle w:val="Hyperlink"/>
@@ -655,7 +655,7 @@
             <w:noProof/>
             <w:webHidden/>
           </w:rPr>
-          <w:instrText xml:space="preserve"> PAGEREF _Toc242912325 \h </w:instrText>
+          <w:instrText xml:space="preserve"> PAGEREF _Toc243212142 \h </w:instrText>
         </w:r>
         <w:r>
           <w:rPr>
@@ -703,7 +703,7 @@
           <w14:ligatures w14:val="standardContextual"/>
         </w:rPr>
       </w:pPr>
-      <w:hyperlink w:anchor="_Toc242912326" w:history="1">
+      <w:hyperlink w:anchor="_Toc243212143" w:history="1">
         <w:r>
           <w:rPr>
             <w:rStyle w:val="Hyperlink"/>
@@ -730,7 +730,7 @@
             <w:noProof/>
             <w:webHidden/>
           </w:rPr>
-          <w:instrText xml:space="preserve"> PAGEREF _Toc242912326 \h </w:instrText>
+          <w:instrText xml:space="preserve"> PAGEREF _Toc243212143 \h </w:instrText>
         </w:r>
         <w:r>
           <w:rPr>
@@ -778,7 +778,7 @@
           <w14:ligatures w14:val="standardContextual"/>
         </w:rPr>
       </w:pPr>
-      <w:hyperlink w:anchor="_Toc242912327" w:history="1">
+      <w:hyperlink w:anchor="_Toc243212144" w:history="1">
         <w:r>
           <w:rPr>
             <w:rStyle w:val="Hyperlink"/>
@@ -805,7 +805,7 @@
             <w:noProof/>
             <w:webHidden/>
           </w:rPr>
-          <w:instrText xml:space="preserve"> PAGEREF _Toc242912327 \h </w:instrText>
+          <w:instrText xml:space="preserve"> PAGEREF _Toc243212144 \h </w:instrText>
         </w:r>
         <w:r>
           <w:rPr>
@@ -853,7 +853,7 @@
           <w14:ligatures w14:val="standardContextual"/>
         </w:rPr>
       </w:pPr>
-      <w:hyperlink w:anchor="_Toc242912328" w:history="1">
+      <w:hyperlink w:anchor="_Toc243212145" w:history="1">
         <w:r>
           <w:rPr>
             <w:rStyle w:val="Hyperlink"/>
@@ -880,7 +880,7 @@
             <w:noProof/>
             <w:webHidden/>
           </w:rPr>
-          <w:instrText xml:space="preserve"> PAGEREF _Toc242912328 \h </w:instrText>
+          <w:instrText xml:space="preserve"> PAGEREF _Toc243212145 \h </w:instrText>
         </w:r>
         <w:r>
           <w:rPr>
@@ -928,7 +928,7 @@
           <w14:ligatures w14:val="standardContextual"/>
         </w:rPr>
       </w:pPr>
-      <w:hyperlink w:anchor="_Toc242912329" w:history="1">
+      <w:hyperlink w:anchor="_Toc243212146" w:history="1">
         <w:r>
           <w:rPr>
             <w:rStyle w:val="Hyperlink"/>
@@ -955,7 +955,7 @@
             <w:noProof/>
             <w:webHidden/>
           </w:rPr>
-          <w:instrText xml:space="preserve"> PAGEREF _Toc242912329 \h </w:instrText>
+          <w:instrText xml:space="preserve"> PAGEREF _Toc243212146 \h </w:instrText>
         </w:r>
         <w:r>
           <w:rPr>
@@ -1003,7 +1003,7 @@
           <w14:ligatures w14:val="standardContextual"/>
         </w:rPr>
       </w:pPr>
-      <w:hyperlink w:anchor="_Toc242912330" w:history="1">
+      <w:hyperlink w:anchor="_Toc243212147" w:history="1">
         <w:r>
           <w:rPr>
             <w:rStyle w:val="Hyperlink"/>
@@ -1030,7 +1030,7 @@
             <w:noProof/>
             <w:webHidden/>
           </w:rPr>
-          <w:instrText xml:space="preserve"> PAGEREF _Toc242912330 \h </w:instrText>
+          <w:instrText xml:space="preserve"> PAGEREF _Toc243212147 \h </w:instrText>
         </w:r>
         <w:r>
           <w:rPr>
@@ -1078,7 +1078,7 @@
           <w14:ligatures w14:val="standardContextual"/>
         </w:rPr>
       </w:pPr>
-      <w:hyperlink w:anchor="_Toc242912331" w:history="1">
+      <w:hyperlink w:anchor="_Toc243212148" w:history="1">
         <w:r>
           <w:rPr>
             <w:rStyle w:val="Hyperlink"/>
@@ -1105,7 +1105,7 @@
             <w:noProof/>
             <w:webHidden/>
           </w:rPr>
-          <w:instrText xml:space="preserve"> PAGEREF _Toc242912331 \h </w:instrText>
+          <w:instrText xml:space="preserve"> PAGEREF _Toc243212148 \h </w:instrText>
         </w:r>
         <w:r>
           <w:rPr>
@@ -1153,7 +1153,7 @@
           <w14:ligatures w14:val="standardContextual"/>
         </w:rPr>
       </w:pPr>
-      <w:hyperlink w:anchor="_Toc242912332" w:history="1">
+      <w:hyperlink w:anchor="_Toc243212149" w:history="1">
         <w:r>
           <w:rPr>
             <w:rStyle w:val="Hyperlink"/>
@@ -1180,7 +1180,7 @@
             <w:noProof/>
             <w:webHidden/>
           </w:rPr>
-          <w:instrText xml:space="preserve"> PAGEREF _Toc242912332 \h </w:instrText>
+          <w:instrText xml:space="preserve"> PAGEREF _Toc243212149 \h </w:instrText>
         </w:r>
         <w:r>
           <w:rPr>
@@ -1228,7 +1228,7 @@
           <w14:ligatures w14:val="standardContextual"/>
         </w:rPr>
       </w:pPr>
-      <w:hyperlink w:anchor="_Toc242912333" w:history="1">
+      <w:hyperlink w:anchor="_Toc243212150" w:history="1">
         <w:r>
           <w:rPr>
             <w:rStyle w:val="Hyperlink"/>
@@ -1255,7 +1255,7 @@
             <w:noProof/>
             <w:webHidden/>
           </w:rPr>
-          <w:instrText xml:space="preserve"> PAGEREF _Toc242912333 \h </w:instrText>
+          <w:instrText xml:space="preserve"> PAGEREF _Toc243212150 \h </w:instrText>
         </w:r>
         <w:r>
           <w:rPr>
@@ -1303,7 +1303,7 @@
           <w14:ligatures w14:val="standardContextual"/>
         </w:rPr>
       </w:pPr>
-      <w:hyperlink w:anchor="_Toc242912334" w:history="1">
+      <w:hyperlink w:anchor="_Toc243212151" w:history="1">
         <w:r>
           <w:rPr>
             <w:rStyle w:val="Hyperlink"/>
@@ -1330,7 +1330,7 @@
             <w:noProof/>
             <w:webHidden/>
           </w:rPr>
-          <w:instrText xml:space="preserve"> PAGEREF _Toc242912334 \h </w:instrText>
+          <w:instrText xml:space="preserve"> PAGEREF _Toc243212151 \h </w:instrText>
         </w:r>
         <w:r>
           <w:rPr>
@@ -1378,7 +1378,7 @@
           <w14:ligatures w14:val="standardContextual"/>
         </w:rPr>
       </w:pPr>
-      <w:hyperlink w:anchor="_Toc242912335" w:history="1">
+      <w:hyperlink w:anchor="_Toc243212152" w:history="1">
         <w:r>
           <w:rPr>
             <w:rStyle w:val="Hyperlink"/>
@@ -1405,7 +1405,7 @@
             <w:noProof/>
             <w:webHidden/>
           </w:rPr>
-          <w:instrText xml:space="preserve"> PAGEREF _Toc242912335 \h </w:instrText>
+          <w:instrText xml:space="preserve"> PAGEREF _Toc243212152 \h </w:instrText>
         </w:r>
         <w:r>
           <w:rPr>
@@ -1453,7 +1453,7 @@
           <w14:ligatures w14:val="standardContextual"/>
         </w:rPr>
       </w:pPr>
-      <w:hyperlink w:anchor="_Toc242912336" w:history="1">
+      <w:hyperlink w:anchor="_Toc243212153" w:history="1">
         <w:r>
           <w:rPr>
             <w:rStyle w:val="Hyperlink"/>
@@ -1480,7 +1480,7 @@
             <w:noProof/>
             <w:webHidden/>
           </w:rPr>
-          <w:instrText xml:space="preserve"> PAGEREF _Toc242912336 \h </w:instrText>
+          <w:instrText xml:space="preserve"> PAGEREF _Toc243212153 \h </w:instrText>
         </w:r>
         <w:r>
           <w:rPr>
@@ -1528,7 +1528,7 @@
           <w14:ligatures w14:val="standardContextual"/>
         </w:rPr>
       </w:pPr>
-      <w:hyperlink w:anchor="_Toc242912337" w:history="1">
+      <w:hyperlink w:anchor="_Toc243212154" w:history="1">
         <w:r>
           <w:rPr>
             <w:rStyle w:val="Hyperlink"/>
@@ -1555,7 +1555,7 @@
             <w:noProof/>
             <w:webHidden/>
           </w:rPr>
-          <w:instrText xml:space="preserve"> PAGEREF _Toc242912337 \h </w:instrText>
+          <w:instrText xml:space="preserve"> PAGEREF _Toc243212154 \h </w:instrText>
         </w:r>
         <w:r>
           <w:rPr>
@@ -1600,7 +1600,7 @@
       <w:pPr>
         <w:pStyle w:val="Heading1"/>
       </w:pPr>
-      <w:bookmarkStart w:id="0" w:name="_Toc242912322"/>
+      <w:bookmarkStart w:id="0" w:name="_Toc243212139"/>
       <w:r>
         <w:t>Document Revision History</w:t>
       </w:r>
@@ -1628,10 +1628,10 @@
         <w:tblLook w:val="04A0" w:firstRow="1" w:lastRow="0" w:firstColumn="1" w:lastColumn="0" w:noHBand="0" w:noVBand="1"/>
       </w:tblPr>
       <w:tblGrid>
-        <w:gridCol w:w="991"/>
-        <w:gridCol w:w="1239"/>
-        <w:gridCol w:w="2142"/>
-        <w:gridCol w:w="4988"/>
+        <w:gridCol w:w="992"/>
+        <w:gridCol w:w="1244"/>
+        <w:gridCol w:w="2069"/>
+        <w:gridCol w:w="5056"/>
       </w:tblGrid>
       <w:tr>
         <w:trPr>
@@ -1640,7 +1640,7 @@
         </w:trPr>
         <w:tc>
           <w:tcPr>
-            <w:tcW w:w="991" w:type="dxa"/>
+            <w:tcW w:w="992" w:type="dxa"/>
             <w:shd w:val="clear" w:color="auto" w:fill="1F3A3D"/>
           </w:tcPr>
           <w:p>
@@ -1660,7 +1660,7 @@
         </w:tc>
         <w:tc>
           <w:tcPr>
-            <w:tcW w:w="1239" w:type="dxa"/>
+            <w:tcW w:w="1244" w:type="dxa"/>
             <w:shd w:val="clear" w:color="auto" w:fill="1F3A3D"/>
           </w:tcPr>
           <w:p>
@@ -1680,7 +1680,7 @@
         </w:tc>
         <w:tc>
           <w:tcPr>
-            <w:tcW w:w="2142" w:type="dxa"/>
+            <w:tcW w:w="2069" w:type="dxa"/>
             <w:shd w:val="clear" w:color="auto" w:fill="1F3A3D"/>
           </w:tcPr>
           <w:p>
@@ -1700,7 +1700,7 @@
         </w:tc>
         <w:tc>
           <w:tcPr>
-            <w:tcW w:w="4988" w:type="dxa"/>
+            <w:tcW w:w="5056" w:type="dxa"/>
             <w:shd w:val="clear" w:color="auto" w:fill="1F3A3D"/>
           </w:tcPr>
           <w:p>
@@ -1725,7 +1725,7 @@
         </w:trPr>
         <w:tc>
           <w:tcPr>
-            <w:tcW w:w="991" w:type="dxa"/>
+            <w:tcW w:w="992" w:type="dxa"/>
           </w:tcPr>
           <w:p>
             <w:pPr>
@@ -1743,7 +1743,7 @@
         </w:tc>
         <w:tc>
           <w:tcPr>
-            <w:tcW w:w="1239" w:type="dxa"/>
+            <w:tcW w:w="1244" w:type="dxa"/>
           </w:tcPr>
           <w:p>
             <w:pPr>
@@ -1760,7 +1760,7 @@
         </w:tc>
         <w:tc>
           <w:tcPr>
-            <w:tcW w:w="2142" w:type="dxa"/>
+            <w:tcW w:w="2069" w:type="dxa"/>
           </w:tcPr>
           <w:p>
             <w:pPr>
@@ -1777,7 +1777,7 @@
         </w:tc>
         <w:tc>
           <w:tcPr>
-            <w:tcW w:w="4988" w:type="dxa"/>
+            <w:tcW w:w="5056" w:type="dxa"/>
           </w:tcPr>
           <w:p>
             <w:pPr>
@@ -1798,7 +1798,7 @@
         </w:trPr>
         <w:tc>
           <w:tcPr>
-            <w:tcW w:w="991" w:type="dxa"/>
+            <w:tcW w:w="992" w:type="dxa"/>
             <w:shd w:val="clear" w:color="auto" w:fill="F3F6F8"/>
           </w:tcPr>
           <w:p>
@@ -1817,7 +1817,7 @@
         </w:tc>
         <w:tc>
           <w:tcPr>
-            <w:tcW w:w="1239" w:type="dxa"/>
+            <w:tcW w:w="1244" w:type="dxa"/>
             <w:shd w:val="clear" w:color="auto" w:fill="F3F6F8"/>
           </w:tcPr>
           <w:p>
@@ -1835,7 +1835,7 @@
         </w:tc>
         <w:tc>
           <w:tcPr>
-            <w:tcW w:w="2142" w:type="dxa"/>
+            <w:tcW w:w="2069" w:type="dxa"/>
             <w:shd w:val="clear" w:color="auto" w:fill="F3F6F8"/>
           </w:tcPr>
           <w:p>
@@ -1853,7 +1853,7 @@
         </w:tc>
         <w:tc>
           <w:tcPr>
-            <w:tcW w:w="4988" w:type="dxa"/>
+            <w:tcW w:w="5056" w:type="dxa"/>
             <w:shd w:val="clear" w:color="auto" w:fill="F3F6F8"/>
           </w:tcPr>
           <w:p>
@@ -2022,7 +2022,7 @@
         </w:trPr>
         <w:tc>
           <w:tcPr>
-            <w:tcW w:w="991" w:type="dxa"/>
+            <w:tcW w:w="992" w:type="dxa"/>
           </w:tcPr>
           <w:p>
             <w:pPr>
@@ -2040,7 +2040,7 @@
         </w:tc>
         <w:tc>
           <w:tcPr>
-            <w:tcW w:w="1239" w:type="dxa"/>
+            <w:tcW w:w="1244" w:type="dxa"/>
           </w:tcPr>
           <w:p>
             <w:pPr>
@@ -2057,7 +2057,7 @@
         </w:tc>
         <w:tc>
           <w:tcPr>
-            <w:tcW w:w="2142" w:type="dxa"/>
+            <w:tcW w:w="2069" w:type="dxa"/>
           </w:tcPr>
           <w:p>
             <w:pPr>
@@ -2068,13 +2068,13 @@
               <w:rPr>
                 <w:sz w:val="17"/>
               </w:rPr>
-              <w:t>Capstone Team (Claude review)</w:t>
-            </w:r>
-          </w:p>
-        </w:tc>
-        <w:tc>
-          <w:tcPr>
-            <w:tcW w:w="4988" w:type="dxa"/>
+              <w:t>Capstone Team</w:t>
+            </w:r>
+          </w:p>
+        </w:tc>
+        <w:tc>
+          <w:tcPr>
+            <w:tcW w:w="5056" w:type="dxa"/>
           </w:tcPr>
           <w:p>
             <w:pPr>
@@ -2096,7 +2096,7 @@
         </w:trPr>
         <w:tc>
           <w:tcPr>
-            <w:tcW w:w="991" w:type="dxa"/>
+            <w:tcW w:w="992" w:type="dxa"/>
             <w:shd w:val="clear" w:color="auto" w:fill="F3F6F8"/>
           </w:tcPr>
           <w:p>
@@ -2115,7 +2115,7 @@
         </w:tc>
         <w:tc>
           <w:tcPr>
-            <w:tcW w:w="1239" w:type="dxa"/>
+            <w:tcW w:w="1244" w:type="dxa"/>
             <w:shd w:val="clear" w:color="auto" w:fill="F3F6F8"/>
           </w:tcPr>
           <w:p>
@@ -2133,7 +2133,7 @@
         </w:tc>
         <w:tc>
           <w:tcPr>
-            <w:tcW w:w="2142" w:type="dxa"/>
+            <w:tcW w:w="2069" w:type="dxa"/>
             <w:shd w:val="clear" w:color="auto" w:fill="F3F6F8"/>
           </w:tcPr>
           <w:p>
@@ -2145,13 +2145,13 @@
               <w:rPr>
                 <w:sz w:val="17"/>
               </w:rPr>
-              <w:t>Capstone Team (Claude, sprint synchronization)</w:t>
-            </w:r>
-          </w:p>
-        </w:tc>
-        <w:tc>
-          <w:tcPr>
-            <w:tcW w:w="4988" w:type="dxa"/>
+              <w:t>Capstone Team (sprint synchronization)</w:t>
+            </w:r>
+          </w:p>
+        </w:tc>
+        <w:tc>
+          <w:tcPr>
+            <w:tcW w:w="5056" w:type="dxa"/>
             <w:shd w:val="clear" w:color="auto" w:fill="F3F6F8"/>
           </w:tcPr>
           <w:p>
@@ -2216,7 +2216,7 @@
         </w:trPr>
         <w:tc>
           <w:tcPr>
-            <w:tcW w:w="991" w:type="dxa"/>
+            <w:tcW w:w="992" w:type="dxa"/>
           </w:tcPr>
           <w:p>
             <w:pPr>
@@ -2234,7 +2234,7 @@
         </w:tc>
         <w:tc>
           <w:tcPr>
-            <w:tcW w:w="1239" w:type="dxa"/>
+            <w:tcW w:w="1244" w:type="dxa"/>
           </w:tcPr>
           <w:p>
             <w:pPr>
@@ -2251,7 +2251,7 @@
         </w:tc>
         <w:tc>
           <w:tcPr>
-            <w:tcW w:w="2142" w:type="dxa"/>
+            <w:tcW w:w="2069" w:type="dxa"/>
           </w:tcPr>
           <w:p>
             <w:pPr>
@@ -2262,13 +2262,13 @@
               <w:rPr>
                 <w:sz w:val="17"/>
               </w:rPr>
-              <w:t>Capstone Team (Claude, submission review)</w:t>
-            </w:r>
-          </w:p>
-        </w:tc>
-        <w:tc>
-          <w:tcPr>
-            <w:tcW w:w="4988" w:type="dxa"/>
+              <w:t>Capstone Team (submission review)</w:t>
+            </w:r>
+          </w:p>
+        </w:tc>
+        <w:tc>
+          <w:tcPr>
+            <w:tcW w:w="5056" w:type="dxa"/>
           </w:tcPr>
           <w:p>
             <w:pPr>
@@ -2318,7 +2318,7 @@
         </w:trPr>
         <w:tc>
           <w:tcPr>
-            <w:tcW w:w="991" w:type="dxa"/>
+            <w:tcW w:w="992" w:type="dxa"/>
             <w:shd w:val="clear" w:color="auto" w:fill="F3F6F8"/>
           </w:tcPr>
           <w:p>
@@ -2337,7 +2337,7 @@
         </w:tc>
         <w:tc>
           <w:tcPr>
-            <w:tcW w:w="1239" w:type="dxa"/>
+            <w:tcW w:w="1244" w:type="dxa"/>
             <w:shd w:val="clear" w:color="auto" w:fill="F3F6F8"/>
           </w:tcPr>
           <w:p>
@@ -2355,7 +2355,7 @@
         </w:tc>
         <w:tc>
           <w:tcPr>
-            <w:tcW w:w="2142" w:type="dxa"/>
+            <w:tcW w:w="2069" w:type="dxa"/>
             <w:shd w:val="clear" w:color="auto" w:fill="F3F6F8"/>
           </w:tcPr>
           <w:p>
@@ -2373,7 +2373,7 @@
         </w:tc>
         <w:tc>
           <w:tcPr>
-            <w:tcW w:w="4988" w:type="dxa"/>
+            <w:tcW w:w="5056" w:type="dxa"/>
             <w:shd w:val="clear" w:color="auto" w:fill="F3F6F8"/>
           </w:tcPr>
           <w:p>
@@ -2396,7 +2396,7 @@
         </w:trPr>
         <w:tc>
           <w:tcPr>
-            <w:tcW w:w="991" w:type="dxa"/>
+            <w:tcW w:w="992" w:type="dxa"/>
           </w:tcPr>
           <w:p>
             <w:pPr>
@@ -2414,7 +2414,7 @@
         </w:tc>
         <w:tc>
           <w:tcPr>
-            <w:tcW w:w="1239" w:type="dxa"/>
+            <w:tcW w:w="1244" w:type="dxa"/>
           </w:tcPr>
           <w:p>
             <w:pPr>
@@ -2431,7 +2431,7 @@
         </w:tc>
         <w:tc>
           <w:tcPr>
-            <w:tcW w:w="2142" w:type="dxa"/>
+            <w:tcW w:w="2069" w:type="dxa"/>
           </w:tcPr>
           <w:p>
             <w:pPr>
@@ -2442,13 +2442,13 @@
               <w:rPr>
                 <w:sz w:val="17"/>
               </w:rPr>
-              <w:t>Capstone Team (Claude, card 30)</w:t>
-            </w:r>
-          </w:p>
-        </w:tc>
-        <w:tc>
-          <w:tcPr>
-            <w:tcW w:w="4988" w:type="dxa"/>
+              <w:t>Capstone Team (card 30)</w:t>
+            </w:r>
+          </w:p>
+        </w:tc>
+        <w:tc>
+          <w:tcPr>
+            <w:tcW w:w="5056" w:type="dxa"/>
           </w:tcPr>
           <w:p>
             <w:pPr>
@@ -2484,7 +2484,7 @@
         </w:trPr>
         <w:tc>
           <w:tcPr>
-            <w:tcW w:w="991" w:type="dxa"/>
+            <w:tcW w:w="992" w:type="dxa"/>
             <w:shd w:val="clear" w:color="auto" w:fill="F3F6F8"/>
           </w:tcPr>
           <w:p>
@@ -2503,7 +2503,7 @@
         </w:tc>
         <w:tc>
           <w:tcPr>
-            <w:tcW w:w="1239" w:type="dxa"/>
+            <w:tcW w:w="1244" w:type="dxa"/>
             <w:shd w:val="clear" w:color="auto" w:fill="F3F6F8"/>
           </w:tcPr>
           <w:p>
@@ -2521,7 +2521,7 @@
         </w:tc>
         <w:tc>
           <w:tcPr>
-            <w:tcW w:w="2142" w:type="dxa"/>
+            <w:tcW w:w="2069" w:type="dxa"/>
             <w:shd w:val="clear" w:color="auto" w:fill="F3F6F8"/>
           </w:tcPr>
           <w:p>
@@ -2533,13 +2533,13 @@
               <w:rPr>
                 <w:sz w:val="17"/>
               </w:rPr>
-              <w:t>Capstone Team (Claude, card 31)</w:t>
-            </w:r>
-          </w:p>
-        </w:tc>
-        <w:tc>
-          <w:tcPr>
-            <w:tcW w:w="4988" w:type="dxa"/>
+              <w:t>Capstone Team (card 31)</w:t>
+            </w:r>
+          </w:p>
+        </w:tc>
+        <w:tc>
+          <w:tcPr>
+            <w:tcW w:w="5056" w:type="dxa"/>
             <w:shd w:val="clear" w:color="auto" w:fill="F3F6F8"/>
           </w:tcPr>
           <w:p>
@@ -2579,7 +2579,7 @@
       <w:pPr>
         <w:pStyle w:val="Heading1"/>
       </w:pPr>
-      <w:bookmarkStart w:id="1" w:name="_Toc242912323"/>
+      <w:bookmarkStart w:id="1" w:name="_Toc243212140"/>
       <w:r>
         <w:t>1. Project Overview &amp; Scope Refactoring</w:t>
       </w:r>
@@ -2589,7 +2589,7 @@
       <w:pPr>
         <w:pStyle w:val="Heading2"/>
       </w:pPr>
-      <w:bookmarkStart w:id="2" w:name="_Toc242912324"/>
+      <w:bookmarkStart w:id="2" w:name="_Toc243212141"/>
       <w:r>
         <w:t>1.1 Project Purpose &amp; Executive Summary</w:t>
       </w:r>
@@ -2607,7 +2607,7 @@
       <w:pPr>
         <w:pStyle w:val="Heading2"/>
       </w:pPr>
-      <w:bookmarkStart w:id="3" w:name="_Toc242912325"/>
+      <w:bookmarkStart w:id="3" w:name="_Toc243212142"/>
       <w:r>
         <w:t>1.2 Interconnected Deliverables Traceability Baseline</w:t>
       </w:r>
@@ -3885,7 +3885,7 @@
       <w:pPr>
         <w:pStyle w:val="Heading2"/>
       </w:pPr>
-      <w:bookmarkStart w:id="4" w:name="_Toc242912326"/>
+      <w:bookmarkStart w:id="4" w:name="_Toc243212143"/>
       <w:r>
         <w:t>1.3 Scope Baseline &amp; Phased Implementation Strategy</w:t>
       </w:r>
@@ -3998,7 +3998,7 @@
       <w:pPr>
         <w:pStyle w:val="Heading1"/>
       </w:pPr>
-      <w:bookmarkStart w:id="5" w:name="_Toc242912327"/>
+      <w:bookmarkStart w:id="5" w:name="_Toc243212144"/>
       <w:r>
         <w:t>2. Work Breakdown Structure (WBS) &amp; Deliverables</w:t>
       </w:r>
@@ -4364,7 +4364,7 @@
       <w:pPr>
         <w:pStyle w:val="Heading1"/>
       </w:pPr>
-      <w:bookmarkStart w:id="6" w:name="_Toc242912328"/>
+      <w:bookmarkStart w:id="6" w:name="_Toc243212145"/>
       <w:r>
         <w:t>3. Activities, Milestones &amp; Revised Master Schedule</w:t>
       </w:r>
@@ -5861,7 +5861,7 @@
       <w:pPr>
         <w:pStyle w:val="Heading1"/>
       </w:pPr>
-      <w:bookmarkStart w:id="7" w:name="_Toc242912329"/>
+      <w:bookmarkStart w:id="7" w:name="_Toc243212146"/>
       <w:r>
         <w:t>4. Resource Allocation &amp; Infrastructure</w:t>
       </w:r>
@@ -5871,7 +5871,7 @@
       <w:pPr>
         <w:pStyle w:val="Heading2"/>
       </w:pPr>
-      <w:bookmarkStart w:id="8" w:name="_Toc242912330"/>
+      <w:bookmarkStart w:id="8" w:name="_Toc243212147"/>
       <w:r>
         <w:t>4.1 Development &amp; Processing Infrastructure</w:t>
       </w:r>
@@ -5953,7 +5953,7 @@
       <w:pPr>
         <w:pStyle w:val="Heading2"/>
       </w:pPr>
-      <w:bookmarkStart w:id="9" w:name="_Toc242912331"/>
+      <w:bookmarkStart w:id="9" w:name="_Toc243212148"/>
       <w:r>
         <w:t>4.2 Target Hardware &amp; Test Fleet</w:t>
       </w:r>
@@ -6011,7 +6011,7 @@
       <w:pPr>
         <w:pStyle w:val="Heading2"/>
       </w:pPr>
-      <w:bookmarkStart w:id="10" w:name="_Toc242912332"/>
+      <w:bookmarkStart w:id="10" w:name="_Toc243212149"/>
       <w:r>
         <w:t>4.3 Software Libraries &amp; Frameworks</w:t>
       </w:r>
@@ -6174,7 +6174,7 @@
       <w:pPr>
         <w:pStyle w:val="Heading1"/>
       </w:pPr>
-      <w:bookmarkStart w:id="11" w:name="_Toc242912333"/>
+      <w:bookmarkStart w:id="11" w:name="_Toc243212150"/>
       <w:r>
         <w:t>5. Team Roles and Responsibilities</w:t>
       </w:r>
@@ -6793,7 +6793,7 @@
       <w:pPr>
         <w:pStyle w:val="Heading1"/>
       </w:pPr>
-      <w:bookmarkStart w:id="12" w:name="_Toc242912334"/>
+      <w:bookmarkStart w:id="12" w:name="_Toc243212151"/>
       <w:r>
         <w:t>6. Comprehensive Risk Management &amp; Mitigation Matrix</w:t>
       </w:r>
@@ -8263,7 +8263,7 @@
       <w:pPr>
         <w:pStyle w:val="Heading1"/>
       </w:pPr>
-      <w:bookmarkStart w:id="13" w:name="_Toc242912335"/>
+      <w:bookmarkStart w:id="13" w:name="_Toc243212152"/>
       <w:r>
         <w:t>7. Configuration Management &amp; Quality Assurance</w:t>
       </w:r>
@@ -8273,7 +8273,7 @@
       <w:pPr>
         <w:pStyle w:val="Heading2"/>
       </w:pPr>
-      <w:bookmarkStart w:id="14" w:name="_Toc242912336"/>
+      <w:bookmarkStart w:id="14" w:name="_Toc243212153"/>
       <w:r>
         <w:t>7.1 Configuration Management &amp; Asset Versioning</w:t>
       </w:r>
@@ -8456,7 +8456,7 @@
       <w:pPr>
         <w:pStyle w:val="Heading2"/>
       </w:pPr>
-      <w:bookmarkStart w:id="15" w:name="_Toc242912337"/>
+      <w:bookmarkStart w:id="15" w:name="_Toc243212154"/>
       <w:r>
         <w:t>7.2 Quality Assurance &amp; Verification Protocol</w:t>
       </w:r>
@@ -8963,31 +8963,31 @@
       </w:rPr>
     </w:lvl>
   </w:abstractNum>
-  <w:num w:numId="1" w16cid:durableId="597257872">
+  <w:num w:numId="1" w16cid:durableId="372315317">
     <w:abstractNumId w:val="8"/>
   </w:num>
-  <w:num w:numId="2" w16cid:durableId="18899581">
+  <w:num w:numId="2" w16cid:durableId="380523537">
     <w:abstractNumId w:val="6"/>
   </w:num>
-  <w:num w:numId="3" w16cid:durableId="374237733">
+  <w:num w:numId="3" w16cid:durableId="516502181">
     <w:abstractNumId w:val="5"/>
   </w:num>
-  <w:num w:numId="4" w16cid:durableId="1219589570">
+  <w:num w:numId="4" w16cid:durableId="696929511">
     <w:abstractNumId w:val="4"/>
   </w:num>
-  <w:num w:numId="5" w16cid:durableId="1277564023">
+  <w:num w:numId="5" w16cid:durableId="374623542">
     <w:abstractNumId w:val="7"/>
   </w:num>
-  <w:num w:numId="6" w16cid:durableId="1491679493">
+  <w:num w:numId="6" w16cid:durableId="1223834963">
     <w:abstractNumId w:val="3"/>
   </w:num>
-  <w:num w:numId="7" w16cid:durableId="888415318">
+  <w:num w:numId="7" w16cid:durableId="871503366">
     <w:abstractNumId w:val="2"/>
   </w:num>
-  <w:num w:numId="8" w16cid:durableId="1560171074">
+  <w:num w:numId="8" w16cid:durableId="751395715">
     <w:abstractNumId w:val="1"/>
   </w:num>
-  <w:num w:numId="9" w16cid:durableId="403334792">
+  <w:num w:numId="9" w16cid:durableId="1411731773">
     <w:abstractNumId w:val="0"/>
   </w:num>
 </w:numbering>
@@ -20382,7 +20382,7 @@
     <w:autoRedefine/>
     <w:uiPriority w:val="39"/>
     <w:unhideWhenUsed/>
-    <w:rsid w:val="00E10879"/>
+    <w:rsid w:val="00562659"/>
     <w:pPr>
       <w:spacing w:after="100"/>
     </w:pPr>
@@ -20394,7 +20394,7 @@
     <w:autoRedefine/>
     <w:uiPriority w:val="39"/>
     <w:unhideWhenUsed/>
-    <w:rsid w:val="00E10879"/>
+    <w:rsid w:val="00562659"/>
     <w:pPr>
       <w:spacing w:after="100"/>
       <w:ind w:left="200"/>
@@ -20405,7 +20405,7 @@
     <w:basedOn w:val="DefaultParagraphFont"/>
     <w:uiPriority w:val="99"/>
     <w:unhideWhenUsed/>
-    <w:rsid w:val="00E10879"/>
+    <w:rsid w:val="00562659"/>
     <w:rPr>
       <w:color w:val="0000FF" w:themeColor="hyperlink"/>
       <w:u w:val="single"/>

</xml_diff>

<commit_message>
docs: synchronize publication and revision dates to October 18, 2026 across deliverables
</commit_message>
<xml_diff>
--- a/docs/submission/playIT_SPMP_v2.0.docx
+++ b/docs/submission/playIT_SPMP_v2.0.docx
@@ -12,7 +12,7 @@
           <w:noProof/>
         </w:rPr>
         <w:drawing>
-          <wp:inline distT="0" distB="0" distL="0" distR="0" wp14:anchorId="6566CF24" wp14:editId="34258E2B">
+          <wp:inline distT="0" distB="0" distL="0" distR="0" wp14:anchorId="2EF4F77B" wp14:editId="06C6E794">
             <wp:extent cx="1463040" cy="1034415"/>
             <wp:effectExtent l="0" t="0" r="0" b="0"/>
             <wp:docPr id="1" name="Picture 1"/>
@@ -209,7 +209,7 @@
               <w:rPr>
                 <w:sz w:val="19"/>
               </w:rPr>
-              <w:t>2.0 (Post-MVP Refactored Baseline), revision 2.6</w:t>
+              <w:t>2.0 (Post-MVP Refactored Baseline), revision 2.7</w:t>
             </w:r>
           </w:p>
         </w:tc>
@@ -245,7 +245,7 @@
               <w:rPr>
                 <w:sz w:val="19"/>
               </w:rPr>
-              <w:t>September 26, 2026 (Revised October 14, 2026)</w:t>
+              <w:t>September 26, 2026 (Revised October 18, 2026)</w:t>
             </w:r>
           </w:p>
         </w:tc>
@@ -403,7 +403,7 @@
       <w:r>
         <w:fldChar w:fldCharType="separate"/>
       </w:r>
-      <w:hyperlink w:anchor="_Toc243212139" w:history="1">
+      <w:hyperlink w:anchor="_Toc243335921" w:history="1">
         <w:r>
           <w:rPr>
             <w:rStyle w:val="Hyperlink"/>
@@ -430,7 +430,7 @@
             <w:noProof/>
             <w:webHidden/>
           </w:rPr>
-          <w:instrText xml:space="preserve"> PAGEREF _Toc243212139 \h </w:instrText>
+          <w:instrText xml:space="preserve"> PAGEREF _Toc243335921 \h </w:instrText>
         </w:r>
         <w:r>
           <w:rPr>
@@ -478,7 +478,7 @@
           <w14:ligatures w14:val="standardContextual"/>
         </w:rPr>
       </w:pPr>
-      <w:hyperlink w:anchor="_Toc243212140" w:history="1">
+      <w:hyperlink w:anchor="_Toc243335922" w:history="1">
         <w:r>
           <w:rPr>
             <w:rStyle w:val="Hyperlink"/>
@@ -505,7 +505,7 @@
             <w:noProof/>
             <w:webHidden/>
           </w:rPr>
-          <w:instrText xml:space="preserve"> PAGEREF _Toc243212140 \h </w:instrText>
+          <w:instrText xml:space="preserve"> PAGEREF _Toc243335922 \h </w:instrText>
         </w:r>
         <w:r>
           <w:rPr>
@@ -553,7 +553,7 @@
           <w14:ligatures w14:val="standardContextual"/>
         </w:rPr>
       </w:pPr>
-      <w:hyperlink w:anchor="_Toc243212141" w:history="1">
+      <w:hyperlink w:anchor="_Toc243335923" w:history="1">
         <w:r>
           <w:rPr>
             <w:rStyle w:val="Hyperlink"/>
@@ -580,7 +580,7 @@
             <w:noProof/>
             <w:webHidden/>
           </w:rPr>
-          <w:instrText xml:space="preserve"> PAGEREF _Toc243212141 \h </w:instrText>
+          <w:instrText xml:space="preserve"> PAGEREF _Toc243335923 \h </w:instrText>
         </w:r>
         <w:r>
           <w:rPr>
@@ -628,7 +628,7 @@
           <w14:ligatures w14:val="standardContextual"/>
         </w:rPr>
       </w:pPr>
-      <w:hyperlink w:anchor="_Toc243212142" w:history="1">
+      <w:hyperlink w:anchor="_Toc243335924" w:history="1">
         <w:r>
           <w:rPr>
             <w:rStyle w:val="Hyperlink"/>
@@ -655,7 +655,7 @@
             <w:noProof/>
             <w:webHidden/>
           </w:rPr>
-          <w:instrText xml:space="preserve"> PAGEREF _Toc243212142 \h </w:instrText>
+          <w:instrText xml:space="preserve"> PAGEREF _Toc243335924 \h </w:instrText>
         </w:r>
         <w:r>
           <w:rPr>
@@ -703,7 +703,7 @@
           <w14:ligatures w14:val="standardContextual"/>
         </w:rPr>
       </w:pPr>
-      <w:hyperlink w:anchor="_Toc243212143" w:history="1">
+      <w:hyperlink w:anchor="_Toc243335925" w:history="1">
         <w:r>
           <w:rPr>
             <w:rStyle w:val="Hyperlink"/>
@@ -730,7 +730,7 @@
             <w:noProof/>
             <w:webHidden/>
           </w:rPr>
-          <w:instrText xml:space="preserve"> PAGEREF _Toc243212143 \h </w:instrText>
+          <w:instrText xml:space="preserve"> PAGEREF _Toc243335925 \h </w:instrText>
         </w:r>
         <w:r>
           <w:rPr>
@@ -778,7 +778,7 @@
           <w14:ligatures w14:val="standardContextual"/>
         </w:rPr>
       </w:pPr>
-      <w:hyperlink w:anchor="_Toc243212144" w:history="1">
+      <w:hyperlink w:anchor="_Toc243335926" w:history="1">
         <w:r>
           <w:rPr>
             <w:rStyle w:val="Hyperlink"/>
@@ -805,7 +805,7 @@
             <w:noProof/>
             <w:webHidden/>
           </w:rPr>
-          <w:instrText xml:space="preserve"> PAGEREF _Toc243212144 \h </w:instrText>
+          <w:instrText xml:space="preserve"> PAGEREF _Toc243335926 \h </w:instrText>
         </w:r>
         <w:r>
           <w:rPr>
@@ -853,7 +853,7 @@
           <w14:ligatures w14:val="standardContextual"/>
         </w:rPr>
       </w:pPr>
-      <w:hyperlink w:anchor="_Toc243212145" w:history="1">
+      <w:hyperlink w:anchor="_Toc243335927" w:history="1">
         <w:r>
           <w:rPr>
             <w:rStyle w:val="Hyperlink"/>
@@ -880,7 +880,7 @@
             <w:noProof/>
             <w:webHidden/>
           </w:rPr>
-          <w:instrText xml:space="preserve"> PAGEREF _Toc243212145 \h </w:instrText>
+          <w:instrText xml:space="preserve"> PAGEREF _Toc243335927 \h </w:instrText>
         </w:r>
         <w:r>
           <w:rPr>
@@ -928,7 +928,7 @@
           <w14:ligatures w14:val="standardContextual"/>
         </w:rPr>
       </w:pPr>
-      <w:hyperlink w:anchor="_Toc243212146" w:history="1">
+      <w:hyperlink w:anchor="_Toc243335928" w:history="1">
         <w:r>
           <w:rPr>
             <w:rStyle w:val="Hyperlink"/>
@@ -955,7 +955,7 @@
             <w:noProof/>
             <w:webHidden/>
           </w:rPr>
-          <w:instrText xml:space="preserve"> PAGEREF _Toc243212146 \h </w:instrText>
+          <w:instrText xml:space="preserve"> PAGEREF _Toc243335928 \h </w:instrText>
         </w:r>
         <w:r>
           <w:rPr>
@@ -1003,7 +1003,7 @@
           <w14:ligatures w14:val="standardContextual"/>
         </w:rPr>
       </w:pPr>
-      <w:hyperlink w:anchor="_Toc243212147" w:history="1">
+      <w:hyperlink w:anchor="_Toc243335929" w:history="1">
         <w:r>
           <w:rPr>
             <w:rStyle w:val="Hyperlink"/>
@@ -1030,7 +1030,7 @@
             <w:noProof/>
             <w:webHidden/>
           </w:rPr>
-          <w:instrText xml:space="preserve"> PAGEREF _Toc243212147 \h </w:instrText>
+          <w:instrText xml:space="preserve"> PAGEREF _Toc243335929 \h </w:instrText>
         </w:r>
         <w:r>
           <w:rPr>
@@ -1078,7 +1078,7 @@
           <w14:ligatures w14:val="standardContextual"/>
         </w:rPr>
       </w:pPr>
-      <w:hyperlink w:anchor="_Toc243212148" w:history="1">
+      <w:hyperlink w:anchor="_Toc243335930" w:history="1">
         <w:r>
           <w:rPr>
             <w:rStyle w:val="Hyperlink"/>
@@ -1105,7 +1105,7 @@
             <w:noProof/>
             <w:webHidden/>
           </w:rPr>
-          <w:instrText xml:space="preserve"> PAGEREF _Toc243212148 \h </w:instrText>
+          <w:instrText xml:space="preserve"> PAGEREF _Toc243335930 \h </w:instrText>
         </w:r>
         <w:r>
           <w:rPr>
@@ -1153,7 +1153,7 @@
           <w14:ligatures w14:val="standardContextual"/>
         </w:rPr>
       </w:pPr>
-      <w:hyperlink w:anchor="_Toc243212149" w:history="1">
+      <w:hyperlink w:anchor="_Toc243335931" w:history="1">
         <w:r>
           <w:rPr>
             <w:rStyle w:val="Hyperlink"/>
@@ -1180,7 +1180,7 @@
             <w:noProof/>
             <w:webHidden/>
           </w:rPr>
-          <w:instrText xml:space="preserve"> PAGEREF _Toc243212149 \h </w:instrText>
+          <w:instrText xml:space="preserve"> PAGEREF _Toc243335931 \h </w:instrText>
         </w:r>
         <w:r>
           <w:rPr>
@@ -1228,7 +1228,7 @@
           <w14:ligatures w14:val="standardContextual"/>
         </w:rPr>
       </w:pPr>
-      <w:hyperlink w:anchor="_Toc243212150" w:history="1">
+      <w:hyperlink w:anchor="_Toc243335932" w:history="1">
         <w:r>
           <w:rPr>
             <w:rStyle w:val="Hyperlink"/>
@@ -1255,7 +1255,7 @@
             <w:noProof/>
             <w:webHidden/>
           </w:rPr>
-          <w:instrText xml:space="preserve"> PAGEREF _Toc243212150 \h </w:instrText>
+          <w:instrText xml:space="preserve"> PAGEREF _Toc243335932 \h </w:instrText>
         </w:r>
         <w:r>
           <w:rPr>
@@ -1303,7 +1303,7 @@
           <w14:ligatures w14:val="standardContextual"/>
         </w:rPr>
       </w:pPr>
-      <w:hyperlink w:anchor="_Toc243212151" w:history="1">
+      <w:hyperlink w:anchor="_Toc243335933" w:history="1">
         <w:r>
           <w:rPr>
             <w:rStyle w:val="Hyperlink"/>
@@ -1330,7 +1330,7 @@
             <w:noProof/>
             <w:webHidden/>
           </w:rPr>
-          <w:instrText xml:space="preserve"> PAGEREF _Toc243212151 \h </w:instrText>
+          <w:instrText xml:space="preserve"> PAGEREF _Toc243335933 \h </w:instrText>
         </w:r>
         <w:r>
           <w:rPr>
@@ -1378,7 +1378,7 @@
           <w14:ligatures w14:val="standardContextual"/>
         </w:rPr>
       </w:pPr>
-      <w:hyperlink w:anchor="_Toc243212152" w:history="1">
+      <w:hyperlink w:anchor="_Toc243335934" w:history="1">
         <w:r>
           <w:rPr>
             <w:rStyle w:val="Hyperlink"/>
@@ -1405,7 +1405,7 @@
             <w:noProof/>
             <w:webHidden/>
           </w:rPr>
-          <w:instrText xml:space="preserve"> PAGEREF _Toc243212152 \h </w:instrText>
+          <w:instrText xml:space="preserve"> PAGEREF _Toc243335934 \h </w:instrText>
         </w:r>
         <w:r>
           <w:rPr>
@@ -1453,7 +1453,7 @@
           <w14:ligatures w14:val="standardContextual"/>
         </w:rPr>
       </w:pPr>
-      <w:hyperlink w:anchor="_Toc243212153" w:history="1">
+      <w:hyperlink w:anchor="_Toc243335935" w:history="1">
         <w:r>
           <w:rPr>
             <w:rStyle w:val="Hyperlink"/>
@@ -1480,7 +1480,7 @@
             <w:noProof/>
             <w:webHidden/>
           </w:rPr>
-          <w:instrText xml:space="preserve"> PAGEREF _Toc243212153 \h </w:instrText>
+          <w:instrText xml:space="preserve"> PAGEREF _Toc243335935 \h </w:instrText>
         </w:r>
         <w:r>
           <w:rPr>
@@ -1528,7 +1528,7 @@
           <w14:ligatures w14:val="standardContextual"/>
         </w:rPr>
       </w:pPr>
-      <w:hyperlink w:anchor="_Toc243212154" w:history="1">
+      <w:hyperlink w:anchor="_Toc243335936" w:history="1">
         <w:r>
           <w:rPr>
             <w:rStyle w:val="Hyperlink"/>
@@ -1555,7 +1555,7 @@
             <w:noProof/>
             <w:webHidden/>
           </w:rPr>
-          <w:instrText xml:space="preserve"> PAGEREF _Toc243212154 \h </w:instrText>
+          <w:instrText xml:space="preserve"> PAGEREF _Toc243335936 \h </w:instrText>
         </w:r>
         <w:r>
           <w:rPr>
@@ -1600,7 +1600,7 @@
       <w:pPr>
         <w:pStyle w:val="Heading1"/>
       </w:pPr>
-      <w:bookmarkStart w:id="0" w:name="_Toc243212139"/>
+      <w:bookmarkStart w:id="0" w:name="_Toc243335921"/>
       <w:r>
         <w:t>Document Revision History</w:t>
       </w:r>
@@ -1628,10 +1628,10 @@
         <w:tblLook w:val="04A0" w:firstRow="1" w:lastRow="0" w:firstColumn="1" w:lastColumn="0" w:noHBand="0" w:noVBand="1"/>
       </w:tblPr>
       <w:tblGrid>
-        <w:gridCol w:w="992"/>
-        <w:gridCol w:w="1244"/>
-        <w:gridCol w:w="2069"/>
-        <w:gridCol w:w="5056"/>
+        <w:gridCol w:w="994"/>
+        <w:gridCol w:w="1255"/>
+        <w:gridCol w:w="2081"/>
+        <w:gridCol w:w="5030"/>
       </w:tblGrid>
       <w:tr>
         <w:trPr>
@@ -1640,7 +1640,7 @@
         </w:trPr>
         <w:tc>
           <w:tcPr>
-            <w:tcW w:w="992" w:type="dxa"/>
+            <w:tcW w:w="994" w:type="dxa"/>
             <w:shd w:val="clear" w:color="auto" w:fill="1F3A3D"/>
           </w:tcPr>
           <w:p>
@@ -1660,7 +1660,7 @@
         </w:tc>
         <w:tc>
           <w:tcPr>
-            <w:tcW w:w="1244" w:type="dxa"/>
+            <w:tcW w:w="1255" w:type="dxa"/>
             <w:shd w:val="clear" w:color="auto" w:fill="1F3A3D"/>
           </w:tcPr>
           <w:p>
@@ -1680,7 +1680,7 @@
         </w:tc>
         <w:tc>
           <w:tcPr>
-            <w:tcW w:w="2069" w:type="dxa"/>
+            <w:tcW w:w="2081" w:type="dxa"/>
             <w:shd w:val="clear" w:color="auto" w:fill="1F3A3D"/>
           </w:tcPr>
           <w:p>
@@ -1700,7 +1700,7 @@
         </w:tc>
         <w:tc>
           <w:tcPr>
-            <w:tcW w:w="5056" w:type="dxa"/>
+            <w:tcW w:w="5030" w:type="dxa"/>
             <w:shd w:val="clear" w:color="auto" w:fill="1F3A3D"/>
           </w:tcPr>
           <w:p>
@@ -1725,7 +1725,7 @@
         </w:trPr>
         <w:tc>
           <w:tcPr>
-            <w:tcW w:w="992" w:type="dxa"/>
+            <w:tcW w:w="994" w:type="dxa"/>
           </w:tcPr>
           <w:p>
             <w:pPr>
@@ -1743,7 +1743,7 @@
         </w:tc>
         <w:tc>
           <w:tcPr>
-            <w:tcW w:w="1244" w:type="dxa"/>
+            <w:tcW w:w="1255" w:type="dxa"/>
           </w:tcPr>
           <w:p>
             <w:pPr>
@@ -1760,7 +1760,7 @@
         </w:tc>
         <w:tc>
           <w:tcPr>
-            <w:tcW w:w="2069" w:type="dxa"/>
+            <w:tcW w:w="2081" w:type="dxa"/>
           </w:tcPr>
           <w:p>
             <w:pPr>
@@ -1777,7 +1777,7 @@
         </w:tc>
         <w:tc>
           <w:tcPr>
-            <w:tcW w:w="5056" w:type="dxa"/>
+            <w:tcW w:w="5030" w:type="dxa"/>
           </w:tcPr>
           <w:p>
             <w:pPr>
@@ -1798,7 +1798,7 @@
         </w:trPr>
         <w:tc>
           <w:tcPr>
-            <w:tcW w:w="992" w:type="dxa"/>
+            <w:tcW w:w="994" w:type="dxa"/>
             <w:shd w:val="clear" w:color="auto" w:fill="F3F6F8"/>
           </w:tcPr>
           <w:p>
@@ -1817,7 +1817,7 @@
         </w:tc>
         <w:tc>
           <w:tcPr>
-            <w:tcW w:w="1244" w:type="dxa"/>
+            <w:tcW w:w="1255" w:type="dxa"/>
             <w:shd w:val="clear" w:color="auto" w:fill="F3F6F8"/>
           </w:tcPr>
           <w:p>
@@ -1835,7 +1835,7 @@
         </w:tc>
         <w:tc>
           <w:tcPr>
-            <w:tcW w:w="2069" w:type="dxa"/>
+            <w:tcW w:w="2081" w:type="dxa"/>
             <w:shd w:val="clear" w:color="auto" w:fill="F3F6F8"/>
           </w:tcPr>
           <w:p>
@@ -1853,7 +1853,7 @@
         </w:tc>
         <w:tc>
           <w:tcPr>
-            <w:tcW w:w="5056" w:type="dxa"/>
+            <w:tcW w:w="5030" w:type="dxa"/>
             <w:shd w:val="clear" w:color="auto" w:fill="F3F6F8"/>
           </w:tcPr>
           <w:p>
@@ -2022,7 +2022,7 @@
         </w:trPr>
         <w:tc>
           <w:tcPr>
-            <w:tcW w:w="992" w:type="dxa"/>
+            <w:tcW w:w="994" w:type="dxa"/>
           </w:tcPr>
           <w:p>
             <w:pPr>
@@ -2040,7 +2040,7 @@
         </w:tc>
         <w:tc>
           <w:tcPr>
-            <w:tcW w:w="1244" w:type="dxa"/>
+            <w:tcW w:w="1255" w:type="dxa"/>
           </w:tcPr>
           <w:p>
             <w:pPr>
@@ -2057,7 +2057,7 @@
         </w:tc>
         <w:tc>
           <w:tcPr>
-            <w:tcW w:w="2069" w:type="dxa"/>
+            <w:tcW w:w="2081" w:type="dxa"/>
           </w:tcPr>
           <w:p>
             <w:pPr>
@@ -2074,7 +2074,7 @@
         </w:tc>
         <w:tc>
           <w:tcPr>
-            <w:tcW w:w="5056" w:type="dxa"/>
+            <w:tcW w:w="5030" w:type="dxa"/>
           </w:tcPr>
           <w:p>
             <w:pPr>
@@ -2096,7 +2096,7 @@
         </w:trPr>
         <w:tc>
           <w:tcPr>
-            <w:tcW w:w="992" w:type="dxa"/>
+            <w:tcW w:w="994" w:type="dxa"/>
             <w:shd w:val="clear" w:color="auto" w:fill="F3F6F8"/>
           </w:tcPr>
           <w:p>
@@ -2115,7 +2115,7 @@
         </w:tc>
         <w:tc>
           <w:tcPr>
-            <w:tcW w:w="1244" w:type="dxa"/>
+            <w:tcW w:w="1255" w:type="dxa"/>
             <w:shd w:val="clear" w:color="auto" w:fill="F3F6F8"/>
           </w:tcPr>
           <w:p>
@@ -2133,7 +2133,7 @@
         </w:tc>
         <w:tc>
           <w:tcPr>
-            <w:tcW w:w="2069" w:type="dxa"/>
+            <w:tcW w:w="2081" w:type="dxa"/>
             <w:shd w:val="clear" w:color="auto" w:fill="F3F6F8"/>
           </w:tcPr>
           <w:p>
@@ -2151,7 +2151,7 @@
         </w:tc>
         <w:tc>
           <w:tcPr>
-            <w:tcW w:w="5056" w:type="dxa"/>
+            <w:tcW w:w="5030" w:type="dxa"/>
             <w:shd w:val="clear" w:color="auto" w:fill="F3F6F8"/>
           </w:tcPr>
           <w:p>
@@ -2216,7 +2216,7 @@
         </w:trPr>
         <w:tc>
           <w:tcPr>
-            <w:tcW w:w="992" w:type="dxa"/>
+            <w:tcW w:w="994" w:type="dxa"/>
           </w:tcPr>
           <w:p>
             <w:pPr>
@@ -2234,7 +2234,7 @@
         </w:tc>
         <w:tc>
           <w:tcPr>
-            <w:tcW w:w="1244" w:type="dxa"/>
+            <w:tcW w:w="1255" w:type="dxa"/>
           </w:tcPr>
           <w:p>
             <w:pPr>
@@ -2251,7 +2251,7 @@
         </w:tc>
         <w:tc>
           <w:tcPr>
-            <w:tcW w:w="2069" w:type="dxa"/>
+            <w:tcW w:w="2081" w:type="dxa"/>
           </w:tcPr>
           <w:p>
             <w:pPr>
@@ -2268,7 +2268,7 @@
         </w:tc>
         <w:tc>
           <w:tcPr>
-            <w:tcW w:w="5056" w:type="dxa"/>
+            <w:tcW w:w="5030" w:type="dxa"/>
           </w:tcPr>
           <w:p>
             <w:pPr>
@@ -2318,7 +2318,7 @@
         </w:trPr>
         <w:tc>
           <w:tcPr>
-            <w:tcW w:w="992" w:type="dxa"/>
+            <w:tcW w:w="994" w:type="dxa"/>
             <w:shd w:val="clear" w:color="auto" w:fill="F3F6F8"/>
           </w:tcPr>
           <w:p>
@@ -2337,7 +2337,7 @@
         </w:tc>
         <w:tc>
           <w:tcPr>
-            <w:tcW w:w="1244" w:type="dxa"/>
+            <w:tcW w:w="1255" w:type="dxa"/>
             <w:shd w:val="clear" w:color="auto" w:fill="F3F6F8"/>
           </w:tcPr>
           <w:p>
@@ -2355,7 +2355,7 @@
         </w:tc>
         <w:tc>
           <w:tcPr>
-            <w:tcW w:w="2069" w:type="dxa"/>
+            <w:tcW w:w="2081" w:type="dxa"/>
             <w:shd w:val="clear" w:color="auto" w:fill="F3F6F8"/>
           </w:tcPr>
           <w:p>
@@ -2373,7 +2373,7 @@
         </w:tc>
         <w:tc>
           <w:tcPr>
-            <w:tcW w:w="5056" w:type="dxa"/>
+            <w:tcW w:w="5030" w:type="dxa"/>
             <w:shd w:val="clear" w:color="auto" w:fill="F3F6F8"/>
           </w:tcPr>
           <w:p>
@@ -2396,7 +2396,7 @@
         </w:trPr>
         <w:tc>
           <w:tcPr>
-            <w:tcW w:w="992" w:type="dxa"/>
+            <w:tcW w:w="994" w:type="dxa"/>
           </w:tcPr>
           <w:p>
             <w:pPr>
@@ -2414,7 +2414,7 @@
         </w:tc>
         <w:tc>
           <w:tcPr>
-            <w:tcW w:w="1244" w:type="dxa"/>
+            <w:tcW w:w="1255" w:type="dxa"/>
           </w:tcPr>
           <w:p>
             <w:pPr>
@@ -2431,7 +2431,7 @@
         </w:tc>
         <w:tc>
           <w:tcPr>
-            <w:tcW w:w="2069" w:type="dxa"/>
+            <w:tcW w:w="2081" w:type="dxa"/>
           </w:tcPr>
           <w:p>
             <w:pPr>
@@ -2448,7 +2448,7 @@
         </w:tc>
         <w:tc>
           <w:tcPr>
-            <w:tcW w:w="5056" w:type="dxa"/>
+            <w:tcW w:w="5030" w:type="dxa"/>
           </w:tcPr>
           <w:p>
             <w:pPr>
@@ -2484,7 +2484,7 @@
         </w:trPr>
         <w:tc>
           <w:tcPr>
-            <w:tcW w:w="992" w:type="dxa"/>
+            <w:tcW w:w="994" w:type="dxa"/>
             <w:shd w:val="clear" w:color="auto" w:fill="F3F6F8"/>
           </w:tcPr>
           <w:p>
@@ -2503,7 +2503,7 @@
         </w:tc>
         <w:tc>
           <w:tcPr>
-            <w:tcW w:w="1244" w:type="dxa"/>
+            <w:tcW w:w="1255" w:type="dxa"/>
             <w:shd w:val="clear" w:color="auto" w:fill="F3F6F8"/>
           </w:tcPr>
           <w:p>
@@ -2521,7 +2521,7 @@
         </w:tc>
         <w:tc>
           <w:tcPr>
-            <w:tcW w:w="2069" w:type="dxa"/>
+            <w:tcW w:w="2081" w:type="dxa"/>
             <w:shd w:val="clear" w:color="auto" w:fill="F3F6F8"/>
           </w:tcPr>
           <w:p>
@@ -2539,7 +2539,7 @@
         </w:tc>
         <w:tc>
           <w:tcPr>
-            <w:tcW w:w="5056" w:type="dxa"/>
+            <w:tcW w:w="5030" w:type="dxa"/>
             <w:shd w:val="clear" w:color="auto" w:fill="F3F6F8"/>
           </w:tcPr>
           <w:p>
@@ -2565,6 +2565,80 @@
                 <w:sz w:val="17"/>
               </w:rPr>
               <w:t>, 433 unit tests) replaces APK G as the submission build. The calmer sound set and Lily's shorter lines (cards 31b, 31c) are with the team lead for a listening review. No change to the later milestones.</w:t>
+            </w:r>
+          </w:p>
+        </w:tc>
+      </w:tr>
+      <w:tr>
+        <w:trPr>
+          <w:cantSplit/>
+          <w:jc w:val="center"/>
+        </w:trPr>
+        <w:tc>
+          <w:tcPr>
+            <w:tcW w:w="994" w:type="dxa"/>
+          </w:tcPr>
+          <w:p>
+            <w:pPr>
+              <w:spacing w:before="20" w:after="20" w:line="252" w:lineRule="auto"/>
+              <w:jc w:val="center"/>
+            </w:pPr>
+            <w:r>
+              <w:rPr>
+                <w:b/>
+                <w:sz w:val="17"/>
+              </w:rPr>
+              <w:t>2.7</w:t>
+            </w:r>
+          </w:p>
+        </w:tc>
+        <w:tc>
+          <w:tcPr>
+            <w:tcW w:w="1255" w:type="dxa"/>
+          </w:tcPr>
+          <w:p>
+            <w:pPr>
+              <w:spacing w:before="20" w:after="20" w:line="252" w:lineRule="auto"/>
+              <w:jc w:val="center"/>
+            </w:pPr>
+            <w:r>
+              <w:rPr>
+                <w:sz w:val="17"/>
+              </w:rPr>
+              <w:t>October 18, 2026</w:t>
+            </w:r>
+          </w:p>
+        </w:tc>
+        <w:tc>
+          <w:tcPr>
+            <w:tcW w:w="2081" w:type="dxa"/>
+          </w:tcPr>
+          <w:p>
+            <w:pPr>
+              <w:spacing w:before="20" w:after="20" w:line="252" w:lineRule="auto"/>
+              <w:jc w:val="center"/>
+            </w:pPr>
+            <w:r>
+              <w:rPr>
+                <w:sz w:val="17"/>
+              </w:rPr>
+              <w:t>Capstone Team</w:t>
+            </w:r>
+          </w:p>
+        </w:tc>
+        <w:tc>
+          <w:tcPr>
+            <w:tcW w:w="5030" w:type="dxa"/>
+          </w:tcPr>
+          <w:p>
+            <w:pPr>
+              <w:spacing w:before="20" w:after="20" w:line="252" w:lineRule="auto"/>
+            </w:pPr>
+            <w:r>
+              <w:rPr>
+                <w:sz w:val="17"/>
+              </w:rPr>
+              <w:t>Final midterm alignment: updated publication date and verified project milestone baseline for IT411 midterm submission.</w:t>
             </w:r>
           </w:p>
         </w:tc>
@@ -2579,7 +2653,7 @@
       <w:pPr>
         <w:pStyle w:val="Heading1"/>
       </w:pPr>
-      <w:bookmarkStart w:id="1" w:name="_Toc243212140"/>
+      <w:bookmarkStart w:id="1" w:name="_Toc243335922"/>
       <w:r>
         <w:t>1. Project Overview &amp; Scope Refactoring</w:t>
       </w:r>
@@ -2589,7 +2663,7 @@
       <w:pPr>
         <w:pStyle w:val="Heading2"/>
       </w:pPr>
-      <w:bookmarkStart w:id="2" w:name="_Toc243212141"/>
+      <w:bookmarkStart w:id="2" w:name="_Toc243335923"/>
       <w:r>
         <w:t>1.1 Project Purpose &amp; Executive Summary</w:t>
       </w:r>
@@ -2607,7 +2681,7 @@
       <w:pPr>
         <w:pStyle w:val="Heading2"/>
       </w:pPr>
-      <w:bookmarkStart w:id="3" w:name="_Toc243212142"/>
+      <w:bookmarkStart w:id="3" w:name="_Toc243335924"/>
       <w:r>
         <w:t>1.2 Interconnected Deliverables Traceability Baseline</w:t>
       </w:r>
@@ -3885,7 +3959,7 @@
       <w:pPr>
         <w:pStyle w:val="Heading2"/>
       </w:pPr>
-      <w:bookmarkStart w:id="4" w:name="_Toc243212143"/>
+      <w:bookmarkStart w:id="4" w:name="_Toc243335925"/>
       <w:r>
         <w:t>1.3 Scope Baseline &amp; Phased Implementation Strategy</w:t>
       </w:r>
@@ -3998,7 +4072,7 @@
       <w:pPr>
         <w:pStyle w:val="Heading1"/>
       </w:pPr>
-      <w:bookmarkStart w:id="5" w:name="_Toc243212144"/>
+      <w:bookmarkStart w:id="5" w:name="_Toc243335926"/>
       <w:r>
         <w:t>2. Work Breakdown Structure (WBS) &amp; Deliverables</w:t>
       </w:r>
@@ -4364,7 +4438,7 @@
       <w:pPr>
         <w:pStyle w:val="Heading1"/>
       </w:pPr>
-      <w:bookmarkStart w:id="6" w:name="_Toc243212145"/>
+      <w:bookmarkStart w:id="6" w:name="_Toc243335927"/>
       <w:r>
         <w:t>3. Activities, Milestones &amp; Revised Master Schedule</w:t>
       </w:r>
@@ -5861,7 +5935,7 @@
       <w:pPr>
         <w:pStyle w:val="Heading1"/>
       </w:pPr>
-      <w:bookmarkStart w:id="7" w:name="_Toc243212146"/>
+      <w:bookmarkStart w:id="7" w:name="_Toc243335928"/>
       <w:r>
         <w:t>4. Resource Allocation &amp; Infrastructure</w:t>
       </w:r>
@@ -5871,7 +5945,7 @@
       <w:pPr>
         <w:pStyle w:val="Heading2"/>
       </w:pPr>
-      <w:bookmarkStart w:id="8" w:name="_Toc243212147"/>
+      <w:bookmarkStart w:id="8" w:name="_Toc243335929"/>
       <w:r>
         <w:t>4.1 Development &amp; Processing Infrastructure</w:t>
       </w:r>
@@ -5953,7 +6027,7 @@
       <w:pPr>
         <w:pStyle w:val="Heading2"/>
       </w:pPr>
-      <w:bookmarkStart w:id="9" w:name="_Toc243212148"/>
+      <w:bookmarkStart w:id="9" w:name="_Toc243335930"/>
       <w:r>
         <w:t>4.2 Target Hardware &amp; Test Fleet</w:t>
       </w:r>
@@ -6011,7 +6085,7 @@
       <w:pPr>
         <w:pStyle w:val="Heading2"/>
       </w:pPr>
-      <w:bookmarkStart w:id="10" w:name="_Toc243212149"/>
+      <w:bookmarkStart w:id="10" w:name="_Toc243335931"/>
       <w:r>
         <w:t>4.3 Software Libraries &amp; Frameworks</w:t>
       </w:r>
@@ -6174,7 +6248,7 @@
       <w:pPr>
         <w:pStyle w:val="Heading1"/>
       </w:pPr>
-      <w:bookmarkStart w:id="11" w:name="_Toc243212150"/>
+      <w:bookmarkStart w:id="11" w:name="_Toc243335932"/>
       <w:r>
         <w:t>5. Team Roles and Responsibilities</w:t>
       </w:r>
@@ -6793,7 +6867,7 @@
       <w:pPr>
         <w:pStyle w:val="Heading1"/>
       </w:pPr>
-      <w:bookmarkStart w:id="12" w:name="_Toc243212151"/>
+      <w:bookmarkStart w:id="12" w:name="_Toc243335933"/>
       <w:r>
         <w:t>6. Comprehensive Risk Management &amp; Mitigation Matrix</w:t>
       </w:r>
@@ -8263,7 +8337,7 @@
       <w:pPr>
         <w:pStyle w:val="Heading1"/>
       </w:pPr>
-      <w:bookmarkStart w:id="13" w:name="_Toc243212152"/>
+      <w:bookmarkStart w:id="13" w:name="_Toc243335934"/>
       <w:r>
         <w:t>7. Configuration Management &amp; Quality Assurance</w:t>
       </w:r>
@@ -8273,7 +8347,7 @@
       <w:pPr>
         <w:pStyle w:val="Heading2"/>
       </w:pPr>
-      <w:bookmarkStart w:id="14" w:name="_Toc243212153"/>
+      <w:bookmarkStart w:id="14" w:name="_Toc243335935"/>
       <w:r>
         <w:t>7.1 Configuration Management &amp; Asset Versioning</w:t>
       </w:r>
@@ -8456,7 +8530,7 @@
       <w:pPr>
         <w:pStyle w:val="Heading2"/>
       </w:pPr>
-      <w:bookmarkStart w:id="15" w:name="_Toc243212154"/>
+      <w:bookmarkStart w:id="15" w:name="_Toc243335936"/>
       <w:r>
         <w:t>7.2 Quality Assurance &amp; Verification Protocol</w:t>
       </w:r>
@@ -8963,31 +9037,31 @@
       </w:rPr>
     </w:lvl>
   </w:abstractNum>
-  <w:num w:numId="1" w16cid:durableId="372315317">
+  <w:num w:numId="1" w16cid:durableId="1810396962">
     <w:abstractNumId w:val="8"/>
   </w:num>
-  <w:num w:numId="2" w16cid:durableId="380523537">
+  <w:num w:numId="2" w16cid:durableId="1316957667">
     <w:abstractNumId w:val="6"/>
   </w:num>
-  <w:num w:numId="3" w16cid:durableId="516502181">
+  <w:num w:numId="3" w16cid:durableId="1945648092">
     <w:abstractNumId w:val="5"/>
   </w:num>
-  <w:num w:numId="4" w16cid:durableId="696929511">
+  <w:num w:numId="4" w16cid:durableId="1813671322">
     <w:abstractNumId w:val="4"/>
   </w:num>
-  <w:num w:numId="5" w16cid:durableId="374623542">
+  <w:num w:numId="5" w16cid:durableId="647638393">
     <w:abstractNumId w:val="7"/>
   </w:num>
-  <w:num w:numId="6" w16cid:durableId="1223834963">
+  <w:num w:numId="6" w16cid:durableId="1752267668">
     <w:abstractNumId w:val="3"/>
   </w:num>
-  <w:num w:numId="7" w16cid:durableId="871503366">
+  <w:num w:numId="7" w16cid:durableId="385640520">
     <w:abstractNumId w:val="2"/>
   </w:num>
-  <w:num w:numId="8" w16cid:durableId="751395715">
+  <w:num w:numId="8" w16cid:durableId="1840387092">
     <w:abstractNumId w:val="1"/>
   </w:num>
-  <w:num w:numId="9" w16cid:durableId="1411731773">
+  <w:num w:numId="9" w16cid:durableId="2105565707">
     <w:abstractNumId w:val="0"/>
   </w:num>
 </w:numbering>
@@ -20382,7 +20456,7 @@
     <w:autoRedefine/>
     <w:uiPriority w:val="39"/>
     <w:unhideWhenUsed/>
-    <w:rsid w:val="00562659"/>
+    <w:rsid w:val="0086584D"/>
     <w:pPr>
       <w:spacing w:after="100"/>
     </w:pPr>
@@ -20394,7 +20468,7 @@
     <w:autoRedefine/>
     <w:uiPriority w:val="39"/>
     <w:unhideWhenUsed/>
-    <w:rsid w:val="00562659"/>
+    <w:rsid w:val="0086584D"/>
     <w:pPr>
       <w:spacing w:after="100"/>
       <w:ind w:left="200"/>
@@ -20405,7 +20479,7 @@
     <w:basedOn w:val="DefaultParagraphFont"/>
     <w:uiPriority w:val="99"/>
     <w:unhideWhenUsed/>
-    <w:rsid w:val="00562659"/>
+    <w:rsid w:val="0086584D"/>
     <w:rPr>
       <w:color w:val="0000FF" w:themeColor="hyperlink"/>
       <w:u w:val="single"/>

</xml_diff>